<commit_message>
up lai bao cao chuong 4
</commit_message>
<xml_diff>
--- a/OOSD_BaoCao_WMS.docx
+++ b/OOSD_BaoCao_WMS.docx
@@ -1672,7 +1672,21 @@
                 <w:rStyle w:val="Hyperlink"/>
                 <w:lang w:val="en-US"/>
               </w:rPr>
-              <w:t>Cơ sở lý thuyết</w:t>
+              <w:t>Cơ sở l</w:t>
+            </w:r>
+            <w:r>
+              <w:rPr>
+                <w:rStyle w:val="Hyperlink"/>
+                <w:lang w:val="en-US"/>
+              </w:rPr>
+              <w:t>ý</w:t>
+            </w:r>
+            <w:r>
+              <w:rPr>
+                <w:rStyle w:val="Hyperlink"/>
+                <w:lang w:val="en-US"/>
+              </w:rPr>
+              <w:t xml:space="preserve"> thuyết</w:t>
             </w:r>
             <w:r>
               <w:rPr>
@@ -4497,7 +4511,7 @@
           <w:szCs w:val="28"/>
           <w:lang w:val="en-US"/>
         </w:rPr>
-        <w:t xml:space="preserve"> Hệ thống sử dụng mã vạch để định danh duy nhất cho từng đối tượng (Sản phẩm, Vị trí kệ, Phiếu nhập/xuất).</w:t>
+        <w:t xml:space="preserve"> Hệ thống sử dụng mã vạch để định danh duy nhất cho từng đối tượng (Sản phẩm, Vị trí kệ).</w:t>
       </w:r>
     </w:p>
     <w:p>
@@ -4532,7 +4546,7 @@
           <w:szCs w:val="28"/>
           <w:lang w:val="en-US"/>
         </w:rPr>
-        <w:t xml:space="preserve"> Loại bỏ hoàn toàn thao tác nhập liệu bằng bàn phím (typing) của nhân viên kho, giảm thiểu sai sót xuống mức thấp nhất.</w:t>
+        <w:t xml:space="preserve"> Loại bỏ thao tác nhập liệu bằng bàn phím (typing) của nhân viên kho, giảm thiểu sai sót xuống mức thấp nhất.</w:t>
       </w:r>
     </w:p>
     <w:p>
@@ -4541,15 +4555,7 @@
           <w:ilvl w:val="0"/>
           <w:numId w:val="60"/>
         </w:numPr>
-        <w:spacing w:before="120" w:after="120" w:line="360" w:lineRule="auto"/>
-        <w:rPr>
-          <w:rFonts w:ascii="Times New Roman" w:hAnsi="Times New Roman" w:cs="Times New Roman"/>
-          <w:sz w:val="28"/>
-          <w:szCs w:val="28"/>
-          <w:lang w:val="en-US"/>
-        </w:rPr>
-      </w:pPr>
-      <w:r>
+        <w:spacing w:after="120" w:line="360" w:lineRule="auto"/>
         <w:rPr>
           <w:rFonts w:ascii="Times New Roman" w:hAnsi="Times New Roman" w:cs="Times New Roman"/>
           <w:b/>
@@ -4558,28 +4564,6 @@
           <w:szCs w:val="28"/>
           <w:lang w:val="en-US"/>
         </w:rPr>
-        <w:lastRenderedPageBreak/>
-        <w:t>Ứng dụng:</w:t>
-      </w:r>
-      <w:r>
-        <w:rPr>
-          <w:rFonts w:ascii="Times New Roman" w:hAnsi="Times New Roman" w:cs="Times New Roman"/>
-          <w:sz w:val="28"/>
-          <w:szCs w:val="28"/>
-          <w:lang w:val="en-US"/>
-        </w:rPr>
-        <w:t xml:space="preserve"> Mã hóa vị trí lưu trữ (Location ID) để hỗ trợ thao tác quét (Scan) nhanh trên thiết bị di động.</w:t>
-      </w:r>
-    </w:p>
-    <w:p>
-      <w:pPr>
-        <w:spacing w:before="120" w:after="120" w:line="360" w:lineRule="auto"/>
-        <w:rPr>
-          <w:rFonts w:ascii="Times New Roman" w:hAnsi="Times New Roman" w:cs="Times New Roman"/>
-          <w:sz w:val="28"/>
-          <w:szCs w:val="28"/>
-          <w:lang w:val="en-US"/>
-        </w:rPr>
       </w:pPr>
       <w:r>
         <w:rPr>
@@ -4590,7 +4574,147 @@
           <w:szCs w:val="28"/>
           <w:lang w:val="en-US"/>
         </w:rPr>
-        <w:t>2.1.2. Chiến lược Quản lý Tồn kho (Inventory Strategy)</w:t>
+        <w:t>Ứng dụng</w:t>
+      </w:r>
+      <w:r>
+        <w:rPr>
+          <w:rFonts w:ascii="Times New Roman" w:hAnsi="Times New Roman" w:cs="Times New Roman"/>
+          <w:b/>
+          <w:bCs/>
+          <w:sz w:val="28"/>
+          <w:szCs w:val="28"/>
+          <w:lang w:val="en-US"/>
+        </w:rPr>
+        <w:t>:</w:t>
+      </w:r>
+    </w:p>
+    <w:p>
+      <w:pPr>
+        <w:numPr>
+          <w:ilvl w:val="1"/>
+          <w:numId w:val="60"/>
+        </w:numPr>
+        <w:spacing w:after="120" w:line="360" w:lineRule="auto"/>
+        <w:rPr>
+          <w:rFonts w:ascii="Times New Roman" w:hAnsi="Times New Roman" w:cs="Times New Roman"/>
+          <w:sz w:val="28"/>
+          <w:szCs w:val="28"/>
+          <w:lang w:val="en-US"/>
+        </w:rPr>
+      </w:pPr>
+      <w:r>
+        <w:rPr>
+          <w:rFonts w:ascii="Times New Roman" w:hAnsi="Times New Roman" w:cs="Times New Roman"/>
+          <w:sz w:val="28"/>
+          <w:szCs w:val="28"/>
+          <w:lang w:val="en-US"/>
+        </w:rPr>
+        <w:lastRenderedPageBreak/>
+        <w:t>Định danh sản phẩm: Mỗi</w:t>
+      </w:r>
+      <w:r>
+        <w:rPr>
+          <w:rFonts w:ascii="Times New Roman" w:hAnsi="Times New Roman" w:cs="Times New Roman"/>
+          <w:sz w:val="28"/>
+          <w:szCs w:val="28"/>
+          <w:lang w:val="en-US"/>
+        </w:rPr>
+        <w:t xml:space="preserve"> sản phẩm</w:t>
+      </w:r>
+      <w:r>
+        <w:rPr>
+          <w:rFonts w:ascii="Times New Roman" w:hAnsi="Times New Roman" w:cs="Times New Roman"/>
+          <w:sz w:val="28"/>
+          <w:szCs w:val="28"/>
+          <w:lang w:val="en-US"/>
+        </w:rPr>
+        <w:t xml:space="preserve"> gắn với một mã vạch</w:t>
+      </w:r>
+      <w:r>
+        <w:rPr>
+          <w:rFonts w:ascii="Times New Roman" w:hAnsi="Times New Roman" w:cs="Times New Roman"/>
+          <w:sz w:val="28"/>
+          <w:szCs w:val="28"/>
+        </w:rPr>
+        <w:t>(thường là EAN-13</w:t>
+      </w:r>
+      <w:r>
+        <w:rPr>
+          <w:rFonts w:ascii="Times New Roman" w:hAnsi="Times New Roman" w:cs="Times New Roman"/>
+          <w:sz w:val="28"/>
+          <w:szCs w:val="28"/>
+          <w:lang w:val="en-US"/>
+        </w:rPr>
+        <w:t>)</w:t>
+      </w:r>
+      <w:r>
+        <w:rPr>
+          <w:rFonts w:ascii="Times New Roman" w:hAnsi="Times New Roman" w:cs="Times New Roman"/>
+          <w:sz w:val="28"/>
+          <w:szCs w:val="28"/>
+          <w:lang w:val="en-US"/>
+        </w:rPr>
+        <w:t xml:space="preserve"> duy nhất.</w:t>
+      </w:r>
+    </w:p>
+    <w:p>
+      <w:pPr>
+        <w:numPr>
+          <w:ilvl w:val="1"/>
+          <w:numId w:val="60"/>
+        </w:numPr>
+        <w:spacing w:before="120" w:after="120" w:line="360" w:lineRule="auto"/>
+        <w:rPr>
+          <w:rFonts w:ascii="Times New Roman" w:hAnsi="Times New Roman" w:cs="Times New Roman"/>
+          <w:sz w:val="28"/>
+          <w:szCs w:val="28"/>
+          <w:lang w:val="en-US"/>
+        </w:rPr>
+      </w:pPr>
+      <w:r>
+        <w:rPr>
+          <w:rFonts w:ascii="Times New Roman" w:hAnsi="Times New Roman" w:cs="Times New Roman"/>
+          <w:sz w:val="28"/>
+          <w:szCs w:val="28"/>
+          <w:lang w:val="en-US"/>
+        </w:rPr>
+        <w:t>Định danh vị trí</w:t>
+      </w:r>
+      <w:r>
+        <w:rPr>
+          <w:rFonts w:ascii="Times New Roman" w:hAnsi="Times New Roman" w:cs="Times New Roman"/>
+          <w:sz w:val="28"/>
+          <w:szCs w:val="28"/>
+          <w:lang w:val="en-US"/>
+        </w:rPr>
+        <w:t xml:space="preserve">: </w:t>
+      </w:r>
+      <w:r>
+        <w:rPr>
+          <w:rFonts w:ascii="Times New Roman" w:hAnsi="Times New Roman" w:cs="Times New Roman"/>
+          <w:sz w:val="28"/>
+          <w:szCs w:val="28"/>
+          <w:lang w:val="en-US"/>
+        </w:rPr>
+        <w:t>Mỗi kệ, tầng, hộc trong kho được mã hóa thành mã vạch (Ví dụ: A-01-02 tức là Khu A</w:t>
+      </w:r>
+      <w:r>
+        <w:rPr>
+          <w:rFonts w:ascii="Times New Roman" w:hAnsi="Times New Roman" w:cs="Times New Roman"/>
+          <w:sz w:val="28"/>
+          <w:szCs w:val="28"/>
+          <w:lang w:val="en-US"/>
+        </w:rPr>
+        <w:t>2.1.2</w:t>
+      </w:r>
+      <w:r>
+        <w:rPr>
+          <w:rFonts w:ascii="Times New Roman" w:hAnsi="Times New Roman" w:cs="Times New Roman"/>
+          <w:sz w:val="28"/>
+          <w:szCs w:val="28"/>
+          <w:lang w:val="en-US"/>
+        </w:rPr>
+        <w:t>)</w:t>
       </w:r>
     </w:p>
     <w:p>
@@ -9760,17 +9884,394 @@
     </w:p>
     <w:p>
       <w:pPr>
+        <w:rPr>
+          <w:rFonts w:ascii="Times New Roman" w:hAnsi="Times New Roman" w:cs="Times New Roman"/>
+          <w:sz w:val="28"/>
+          <w:szCs w:val="28"/>
+          <w:lang w:val="en-US"/>
+        </w:rPr>
+      </w:pPr>
+      <w:r>
+        <w:rPr>
+          <w:rFonts w:ascii="Times New Roman" w:hAnsi="Times New Roman" w:cs="Times New Roman"/>
+          <w:sz w:val="28"/>
+          <w:szCs w:val="28"/>
+          <w:lang w:val="en-US"/>
+        </w:rPr>
+        <w:t>- Frontend (Giao diện người dùng):</w:t>
+      </w:r>
+    </w:p>
+    <w:p>
+      <w:pPr>
+        <w:numPr>
+          <w:ilvl w:val="0"/>
+          <w:numId w:val="79"/>
+        </w:numPr>
+        <w:rPr>
+          <w:rFonts w:ascii="Times New Roman" w:hAnsi="Times New Roman" w:cs="Times New Roman"/>
+          <w:sz w:val="28"/>
+          <w:szCs w:val="28"/>
+          <w:lang w:val="en-US"/>
+        </w:rPr>
+      </w:pPr>
+      <w:r>
+        <w:rPr>
+          <w:rFonts w:ascii="Times New Roman" w:hAnsi="Times New Roman" w:cs="Times New Roman"/>
+          <w:sz w:val="28"/>
+          <w:szCs w:val="28"/>
+          <w:lang w:val="en-US"/>
+        </w:rPr>
+        <w:t xml:space="preserve">Framework/Thư viện: React 18 </w:t>
+      </w:r>
+    </w:p>
+    <w:p>
+      <w:pPr>
+        <w:numPr>
+          <w:ilvl w:val="0"/>
+          <w:numId w:val="79"/>
+        </w:numPr>
+        <w:rPr>
+          <w:rFonts w:ascii="Times New Roman" w:hAnsi="Times New Roman" w:cs="Times New Roman"/>
+          <w:sz w:val="28"/>
+          <w:szCs w:val="28"/>
+          <w:lang w:val="en-US"/>
+        </w:rPr>
+      </w:pPr>
+      <w:r>
+        <w:rPr>
+          <w:rFonts w:ascii="Times New Roman" w:hAnsi="Times New Roman" w:cs="Times New Roman"/>
+          <w:sz w:val="28"/>
+          <w:szCs w:val="28"/>
+          <w:lang w:val="en-US"/>
+        </w:rPr>
+        <w:t>Trình xây dựng (Bundler): Vite</w:t>
+      </w:r>
+    </w:p>
+    <w:p>
+      <w:pPr>
+        <w:numPr>
+          <w:ilvl w:val="0"/>
+          <w:numId w:val="79"/>
+        </w:numPr>
+        <w:rPr>
+          <w:rFonts w:ascii="Times New Roman" w:hAnsi="Times New Roman" w:cs="Times New Roman"/>
+          <w:sz w:val="28"/>
+          <w:szCs w:val="28"/>
+          <w:lang w:val="en-US"/>
+        </w:rPr>
+      </w:pPr>
+      <w:r>
+        <w:rPr>
+          <w:rFonts w:ascii="Times New Roman" w:hAnsi="Times New Roman" w:cs="Times New Roman"/>
+          <w:sz w:val="28"/>
+          <w:szCs w:val="28"/>
+          <w:lang w:val="en-US"/>
+        </w:rPr>
+        <w:t>Tạo kiểu (Styling): TailwindCSS</w:t>
+      </w:r>
+    </w:p>
+    <w:p>
+      <w:pPr>
+        <w:numPr>
+          <w:ilvl w:val="0"/>
+          <w:numId w:val="79"/>
+        </w:numPr>
+        <w:rPr>
+          <w:rFonts w:ascii="Times New Roman" w:hAnsi="Times New Roman" w:cs="Times New Roman"/>
+          <w:sz w:val="28"/>
+          <w:szCs w:val="28"/>
+          <w:lang w:val="en-US"/>
+        </w:rPr>
+      </w:pPr>
+      <w:r>
+        <w:rPr>
+          <w:rFonts w:ascii="Times New Roman" w:hAnsi="Times New Roman" w:cs="Times New Roman"/>
+          <w:sz w:val="28"/>
+          <w:szCs w:val="28"/>
+          <w:lang w:val="en-US"/>
+        </w:rPr>
+        <w:t>Client API: Axios (với interceptors để xử lý token và lỗi).</w:t>
+      </w:r>
+    </w:p>
+    <w:p>
+      <w:pPr>
+        <w:numPr>
+          <w:ilvl w:val="0"/>
+          <w:numId w:val="79"/>
+        </w:numPr>
+        <w:rPr>
+          <w:rFonts w:ascii="Times New Roman" w:hAnsi="Times New Roman" w:cs="Times New Roman"/>
+          <w:sz w:val="28"/>
+          <w:szCs w:val="28"/>
+          <w:lang w:val="en-US"/>
+        </w:rPr>
+      </w:pPr>
+      <w:r>
+        <w:rPr>
+          <w:rFonts w:ascii="Times New Roman" w:hAnsi="Times New Roman" w:cs="Times New Roman"/>
+          <w:sz w:val="28"/>
+          <w:szCs w:val="28"/>
+          <w:lang w:val="en-US"/>
+        </w:rPr>
+        <w:t>Xử lý mã vạch (Web Scan): Html5-qrcode</w:t>
+      </w:r>
+    </w:p>
+    <w:p>
+      <w:pPr>
+        <w:rPr>
+          <w:rFonts w:ascii="Times New Roman" w:hAnsi="Times New Roman" w:cs="Times New Roman"/>
+          <w:sz w:val="28"/>
+          <w:szCs w:val="28"/>
+          <w:lang w:val="en-US"/>
+        </w:rPr>
+      </w:pPr>
+      <w:r>
+        <w:rPr>
+          <w:rFonts w:ascii="Times New Roman" w:hAnsi="Times New Roman" w:cs="Times New Roman"/>
+          <w:sz w:val="28"/>
+          <w:szCs w:val="28"/>
+          <w:lang w:val="en-US"/>
+        </w:rPr>
+        <w:t>- Backend (Hệ thống quản trị):</w:t>
+      </w:r>
+    </w:p>
+    <w:p>
+      <w:pPr>
+        <w:numPr>
+          <w:ilvl w:val="0"/>
+          <w:numId w:val="80"/>
+        </w:numPr>
+        <w:rPr>
+          <w:rFonts w:ascii="Times New Roman" w:hAnsi="Times New Roman" w:cs="Times New Roman"/>
+          <w:sz w:val="28"/>
+          <w:szCs w:val="28"/>
+          <w:lang w:val="en-US"/>
+        </w:rPr>
+      </w:pPr>
+      <w:r>
+        <w:rPr>
+          <w:rFonts w:ascii="Times New Roman" w:hAnsi="Times New Roman" w:cs="Times New Roman"/>
+          <w:sz w:val="28"/>
+          <w:szCs w:val="28"/>
+          <w:lang w:val="en-US"/>
+        </w:rPr>
+        <w:t>Ngôn ngữ: Java JDK 21.</w:t>
+      </w:r>
+    </w:p>
+    <w:p>
+      <w:pPr>
+        <w:numPr>
+          <w:ilvl w:val="0"/>
+          <w:numId w:val="80"/>
+        </w:numPr>
+        <w:rPr>
+          <w:rFonts w:ascii="Times New Roman" w:hAnsi="Times New Roman" w:cs="Times New Roman"/>
+          <w:sz w:val="28"/>
+          <w:szCs w:val="28"/>
+          <w:lang w:val="en-US"/>
+        </w:rPr>
+      </w:pPr>
+      <w:r>
+        <w:rPr>
+          <w:rFonts w:ascii="Times New Roman" w:hAnsi="Times New Roman" w:cs="Times New Roman"/>
+          <w:sz w:val="28"/>
+          <w:szCs w:val="28"/>
+          <w:lang w:val="en-US"/>
+        </w:rPr>
+        <w:t>Framework: Spring Boot 4.0.1 (Xây dựng RESTful).</w:t>
+      </w:r>
+    </w:p>
+    <w:p>
+      <w:pPr>
+        <w:numPr>
+          <w:ilvl w:val="0"/>
+          <w:numId w:val="80"/>
+        </w:numPr>
+        <w:rPr>
+          <w:rFonts w:ascii="Times New Roman" w:hAnsi="Times New Roman" w:cs="Times New Roman"/>
+          <w:sz w:val="28"/>
+          <w:szCs w:val="28"/>
+          <w:lang w:val="en-US"/>
+        </w:rPr>
+      </w:pPr>
+      <w:r>
+        <w:rPr>
+          <w:rFonts w:ascii="Times New Roman" w:hAnsi="Times New Roman" w:cs="Times New Roman"/>
+          <w:sz w:val="28"/>
+          <w:szCs w:val="28"/>
+          <w:lang w:val="en-US"/>
+        </w:rPr>
+        <w:t>CSDL tương tác (ORM): Spring Data JPA / Hibernate.</w:t>
+      </w:r>
+    </w:p>
+    <w:p>
+      <w:pPr>
+        <w:numPr>
+          <w:ilvl w:val="0"/>
+          <w:numId w:val="80"/>
+        </w:numPr>
+        <w:rPr>
+          <w:rFonts w:ascii="Times New Roman" w:hAnsi="Times New Roman" w:cs="Times New Roman"/>
+          <w:sz w:val="28"/>
+          <w:szCs w:val="28"/>
+          <w:lang w:val="en-US"/>
+        </w:rPr>
+      </w:pPr>
+      <w:r>
+        <w:rPr>
+          <w:rFonts w:ascii="Times New Roman" w:hAnsi="Times New Roman" w:cs="Times New Roman"/>
+          <w:sz w:val="28"/>
+          <w:szCs w:val="28"/>
+          <w:lang w:val="en-US"/>
+        </w:rPr>
+        <w:t>Xác thực (Authentication): Spring Security + JWT</w:t>
+      </w:r>
+    </w:p>
+    <w:p>
+      <w:pPr>
+        <w:numPr>
+          <w:ilvl w:val="0"/>
+          <w:numId w:val="80"/>
+        </w:numPr>
+        <w:rPr>
+          <w:rFonts w:ascii="Times New Roman" w:hAnsi="Times New Roman" w:cs="Times New Roman"/>
+          <w:sz w:val="28"/>
+          <w:szCs w:val="28"/>
+          <w:lang w:val="en-US"/>
+        </w:rPr>
+      </w:pPr>
+      <w:r>
+        <w:rPr>
+          <w:rFonts w:ascii="Times New Roman" w:hAnsi="Times New Roman" w:cs="Times New Roman"/>
+          <w:sz w:val="28"/>
+          <w:szCs w:val="28"/>
+          <w:lang w:val="en-US"/>
+        </w:rPr>
+        <w:t>Xử lý Excel: Apache POI</w:t>
+      </w:r>
+    </w:p>
+    <w:p>
+      <w:pPr>
+        <w:numPr>
+          <w:ilvl w:val="0"/>
+          <w:numId w:val="80"/>
+        </w:numPr>
+        <w:rPr>
+          <w:rFonts w:ascii="Times New Roman" w:hAnsi="Times New Roman" w:cs="Times New Roman"/>
+          <w:sz w:val="28"/>
+          <w:szCs w:val="28"/>
+          <w:lang w:val="en-US"/>
+        </w:rPr>
+      </w:pPr>
+      <w:r>
+        <w:rPr>
+          <w:rFonts w:ascii="Times New Roman" w:hAnsi="Times New Roman" w:cs="Times New Roman"/>
+          <w:sz w:val="28"/>
+          <w:szCs w:val="28"/>
+          <w:lang w:val="en-US"/>
+        </w:rPr>
+        <w:t>Xử lý mã vạch: Zxing</w:t>
+      </w:r>
+    </w:p>
+    <w:p>
+      <w:pPr>
+        <w:numPr>
+          <w:ilvl w:val="0"/>
+          <w:numId w:val="80"/>
+        </w:numPr>
+        <w:rPr>
+          <w:rFonts w:ascii="Times New Roman" w:hAnsi="Times New Roman" w:cs="Times New Roman"/>
+          <w:sz w:val="28"/>
+          <w:szCs w:val="28"/>
+          <w:lang w:val="en-US"/>
+        </w:rPr>
+      </w:pPr>
+      <w:r>
+        <w:rPr>
+          <w:rFonts w:ascii="Times New Roman" w:hAnsi="Times New Roman" w:cs="Times New Roman"/>
+          <w:sz w:val="28"/>
+          <w:szCs w:val="28"/>
+          <w:lang w:val="en-US"/>
+        </w:rPr>
+        <w:t>Tiện ích code: Lombok</w:t>
+      </w:r>
+    </w:p>
+    <w:p>
+      <w:pPr>
+        <w:rPr>
+          <w:rFonts w:ascii="Times New Roman" w:hAnsi="Times New Roman" w:cs="Times New Roman"/>
+          <w:sz w:val="28"/>
+          <w:szCs w:val="28"/>
+          <w:lang w:val="en-US"/>
+        </w:rPr>
+      </w:pPr>
+      <w:r>
+        <w:rPr>
+          <w:rFonts w:ascii="Times New Roman" w:hAnsi="Times New Roman" w:cs="Times New Roman"/>
+          <w:sz w:val="28"/>
+          <w:szCs w:val="28"/>
+          <w:lang w:val="en-US"/>
+        </w:rPr>
+        <w:t>- Cơ sở dữ liệu, Hạ tầng &amp; Công cụ hỗ trợ:</w:t>
+      </w:r>
+    </w:p>
+    <w:p>
+      <w:pPr>
+        <w:numPr>
+          <w:ilvl w:val="0"/>
+          <w:numId w:val="81"/>
+        </w:numPr>
+        <w:rPr>
+          <w:rFonts w:ascii="Times New Roman" w:hAnsi="Times New Roman" w:cs="Times New Roman"/>
+          <w:sz w:val="28"/>
+          <w:szCs w:val="28"/>
+          <w:lang w:val="en-US"/>
+        </w:rPr>
+      </w:pPr>
+      <w:r>
+        <w:rPr>
+          <w:rFonts w:ascii="Times New Roman" w:hAnsi="Times New Roman" w:cs="Times New Roman"/>
+          <w:sz w:val="28"/>
+          <w:szCs w:val="28"/>
+          <w:lang w:val="en-US"/>
+        </w:rPr>
+        <w:t>Hệ quản trị CSDL: MySQL 8.0</w:t>
+      </w:r>
+    </w:p>
+    <w:p>
+      <w:pPr>
+        <w:numPr>
+          <w:ilvl w:val="0"/>
+          <w:numId w:val="81"/>
+        </w:numPr>
+        <w:rPr>
+          <w:rFonts w:ascii="Times New Roman" w:hAnsi="Times New Roman" w:cs="Times New Roman"/>
+          <w:sz w:val="28"/>
+          <w:szCs w:val="28"/>
+          <w:lang w:val="en-US"/>
+        </w:rPr>
+      </w:pPr>
+      <w:r>
+        <w:rPr>
+          <w:rFonts w:ascii="Times New Roman" w:hAnsi="Times New Roman" w:cs="Times New Roman"/>
+          <w:sz w:val="28"/>
+          <w:szCs w:val="28"/>
+          <w:lang w:val="en-US"/>
+        </w:rPr>
+        <w:t>Kiểm thử API: Postman</w:t>
+      </w:r>
+    </w:p>
+    <w:p>
+      <w:pPr>
+        <w:rPr>
+          <w:lang w:val="en-US"/>
+        </w:rPr>
+      </w:pPr>
+    </w:p>
+    <w:p>
+      <w:pPr>
         <w:pStyle w:val="Heading2"/>
         <w:spacing w:before="120" w:line="360" w:lineRule="auto"/>
-        <w:rPr>
-          <w:noProof/>
-          <w:sz w:val="34"/>
-          <w:szCs w:val="34"/>
-          <w:lang w:val="en-US"/>
-        </w:rPr>
-      </w:pPr>
-      <w:bookmarkStart w:id="17" w:name="_Toc218018534"/>
-      <w:r>
         <w:rPr>
           <w:rStyle w:val="Strong"/>
           <w:b/>
@@ -9778,9 +10279,10 @@
           <w:noProof/>
           <w:sz w:val="34"/>
           <w:szCs w:val="34"/>
-        </w:rPr>
-        <w:t xml:space="preserve">4.2. </w:t>
-      </w:r>
+          <w:lang w:val="en-US"/>
+        </w:rPr>
+      </w:pPr>
+      <w:bookmarkStart w:id="17" w:name="_Toc218018534"/>
       <w:r>
         <w:rPr>
           <w:rStyle w:val="Strong"/>
@@ -9789,11 +10291,1487 @@
           <w:noProof/>
           <w:sz w:val="34"/>
           <w:szCs w:val="34"/>
+        </w:rPr>
+        <w:lastRenderedPageBreak/>
+        <w:t xml:space="preserve">4.2. </w:t>
+      </w:r>
+      <w:r>
+        <w:rPr>
+          <w:rStyle w:val="Strong"/>
+          <w:b/>
+          <w:bCs w:val="0"/>
+          <w:noProof/>
+          <w:sz w:val="34"/>
+          <w:szCs w:val="34"/>
           <w:lang w:val="en-US"/>
         </w:rPr>
         <w:t>Cấu trúc dự án</w:t>
       </w:r>
       <w:bookmarkEnd w:id="17"/>
+    </w:p>
+    <w:p>
+      <w:pPr>
+        <w:rPr>
+          <w:lang w:val="en-US"/>
+        </w:rPr>
+      </w:pPr>
+      <w:r>
+        <w:rPr>
+          <w:rFonts w:ascii="Segoe UI Emoji" w:hAnsi="Segoe UI Emoji" w:cs="Segoe UI Emoji"/>
+          <w:lang w:val="en-US"/>
+        </w:rPr>
+        <w:t>📁</w:t>
+      </w:r>
+      <w:r>
+        <w:rPr>
+          <w:lang w:val="en-US"/>
+        </w:rPr>
+        <w:t xml:space="preserve"> OOSD_Warehouse-Management-System/</w:t>
+      </w:r>
+    </w:p>
+    <w:p>
+      <w:pPr>
+        <w:rPr>
+          <w:lang w:val="en-US"/>
+        </w:rPr>
+      </w:pPr>
+      <w:r>
+        <w:rPr>
+          <w:lang w:val="en-US"/>
+        </w:rPr>
+        <w:t>│</w:t>
+      </w:r>
+    </w:p>
+    <w:p>
+      <w:pPr>
+        <w:rPr>
+          <w:lang w:val="en-US"/>
+        </w:rPr>
+      </w:pPr>
+      <w:r>
+        <w:rPr>
+          <w:lang w:val="en-US"/>
+        </w:rPr>
+        <w:t xml:space="preserve">├── </w:t>
+      </w:r>
+      <w:r>
+        <w:rPr>
+          <w:rFonts w:ascii="Segoe UI Emoji" w:hAnsi="Segoe UI Emoji" w:cs="Segoe UI Emoji"/>
+          <w:lang w:val="en-US"/>
+        </w:rPr>
+        <w:t>📁</w:t>
+      </w:r>
+      <w:r>
+        <w:rPr>
+          <w:lang w:val="en-US"/>
+        </w:rPr>
+        <w:t xml:space="preserve"> backend/                         # Backend - Spring Boot</w:t>
+      </w:r>
+    </w:p>
+    <w:p>
+      <w:pPr>
+        <w:rPr>
+          <w:lang w:val="en-US"/>
+        </w:rPr>
+      </w:pPr>
+      <w:r>
+        <w:rPr>
+          <w:lang w:val="en-US"/>
+        </w:rPr>
+        <w:t xml:space="preserve">│   ├── </w:t>
+      </w:r>
+      <w:r>
+        <w:rPr>
+          <w:rFonts w:ascii="Segoe UI Emoji" w:hAnsi="Segoe UI Emoji" w:cs="Segoe UI Emoji"/>
+          <w:lang w:val="en-US"/>
+        </w:rPr>
+        <w:t>📁</w:t>
+      </w:r>
+      <w:r>
+        <w:rPr>
+          <w:lang w:val="en-US"/>
+        </w:rPr>
+        <w:t xml:space="preserve"> src/</w:t>
+      </w:r>
+    </w:p>
+    <w:p>
+      <w:pPr>
+        <w:rPr>
+          <w:lang w:val="en-US"/>
+        </w:rPr>
+      </w:pPr>
+      <w:r>
+        <w:rPr>
+          <w:lang w:val="en-US"/>
+        </w:rPr>
+        <w:t xml:space="preserve">│   │   ├── </w:t>
+      </w:r>
+      <w:r>
+        <w:rPr>
+          <w:rFonts w:ascii="Segoe UI Emoji" w:hAnsi="Segoe UI Emoji" w:cs="Segoe UI Emoji"/>
+          <w:lang w:val="en-US"/>
+        </w:rPr>
+        <w:t>📁</w:t>
+      </w:r>
+      <w:r>
+        <w:rPr>
+          <w:lang w:val="en-US"/>
+        </w:rPr>
+        <w:t xml:space="preserve"> main/</w:t>
+      </w:r>
+    </w:p>
+    <w:p>
+      <w:pPr>
+        <w:rPr>
+          <w:lang w:val="en-US"/>
+        </w:rPr>
+      </w:pPr>
+      <w:r>
+        <w:rPr>
+          <w:lang w:val="en-US"/>
+        </w:rPr>
+        <w:t xml:space="preserve">│   │   │   ├── </w:t>
+      </w:r>
+      <w:r>
+        <w:rPr>
+          <w:rFonts w:ascii="Segoe UI Emoji" w:hAnsi="Segoe UI Emoji" w:cs="Segoe UI Emoji"/>
+          <w:lang w:val="en-US"/>
+        </w:rPr>
+        <w:t>📁</w:t>
+      </w:r>
+      <w:r>
+        <w:rPr>
+          <w:lang w:val="en-US"/>
+        </w:rPr>
+        <w:t xml:space="preserve"> java/</w:t>
+      </w:r>
+    </w:p>
+    <w:p>
+      <w:pPr>
+        <w:rPr>
+          <w:lang w:val="en-US"/>
+        </w:rPr>
+      </w:pPr>
+      <w:r>
+        <w:rPr>
+          <w:lang w:val="en-US"/>
+        </w:rPr>
+        <w:t xml:space="preserve">│   │   │   │   └── </w:t>
+      </w:r>
+      <w:r>
+        <w:rPr>
+          <w:rFonts w:ascii="Segoe UI Emoji" w:hAnsi="Segoe UI Emoji" w:cs="Segoe UI Emoji"/>
+          <w:lang w:val="en-US"/>
+        </w:rPr>
+        <w:t>📁</w:t>
+      </w:r>
+      <w:r>
+        <w:rPr>
+          <w:lang w:val="en-US"/>
+        </w:rPr>
+        <w:t xml:space="preserve"> edu/uth/wms/</w:t>
+      </w:r>
+    </w:p>
+    <w:p>
+      <w:pPr>
+        <w:rPr>
+          <w:lang w:val="en-US"/>
+        </w:rPr>
+      </w:pPr>
+      <w:r>
+        <w:rPr>
+          <w:lang w:val="en-US"/>
+        </w:rPr>
+        <w:t xml:space="preserve">│   │   │   │       ├── </w:t>
+      </w:r>
+      <w:r>
+        <w:rPr>
+          <w:rFonts w:ascii="Segoe UI Emoji" w:hAnsi="Segoe UI Emoji" w:cs="Segoe UI Emoji"/>
+          <w:lang w:val="en-US"/>
+        </w:rPr>
+        <w:t>📁</w:t>
+      </w:r>
+      <w:r>
+        <w:rPr>
+          <w:lang w:val="en-US"/>
+        </w:rPr>
+        <w:t xml:space="preserve"> config/       # Security, JWT, MVC config</w:t>
+      </w:r>
+    </w:p>
+    <w:p>
+      <w:pPr>
+        <w:rPr>
+          <w:lang w:val="en-US"/>
+        </w:rPr>
+      </w:pPr>
+      <w:r>
+        <w:rPr>
+          <w:lang w:val="en-US"/>
+        </w:rPr>
+        <w:t xml:space="preserve">│   │   │   │       ├── </w:t>
+      </w:r>
+      <w:r>
+        <w:rPr>
+          <w:rFonts w:ascii="Segoe UI Emoji" w:hAnsi="Segoe UI Emoji" w:cs="Segoe UI Emoji"/>
+          <w:lang w:val="en-US"/>
+        </w:rPr>
+        <w:t>📁</w:t>
+      </w:r>
+      <w:r>
+        <w:rPr>
+          <w:lang w:val="en-US"/>
+        </w:rPr>
+        <w:t xml:space="preserve"> controller/   # REST API Controllers</w:t>
+      </w:r>
+    </w:p>
+    <w:p>
+      <w:pPr>
+        <w:rPr>
+          <w:lang w:val="en-US"/>
+        </w:rPr>
+      </w:pPr>
+      <w:r>
+        <w:rPr>
+          <w:lang w:val="en-US"/>
+        </w:rPr>
+        <w:t xml:space="preserve">│   │   │   │       │   └── </w:t>
+      </w:r>
+      <w:r>
+        <w:rPr>
+          <w:rFonts w:ascii="Segoe UI Emoji" w:hAnsi="Segoe UI Emoji" w:cs="Segoe UI Emoji"/>
+          <w:lang w:val="en-US"/>
+        </w:rPr>
+        <w:t>📁</w:t>
+      </w:r>
+      <w:r>
+        <w:rPr>
+          <w:lang w:val="en-US"/>
+        </w:rPr>
+        <w:t xml:space="preserve"> jwt/       # Auth &amp; JWT Controller</w:t>
+      </w:r>
+    </w:p>
+    <w:p>
+      <w:pPr>
+        <w:rPr>
+          <w:lang w:val="en-US"/>
+        </w:rPr>
+      </w:pPr>
+      <w:r>
+        <w:rPr>
+          <w:lang w:val="en-US"/>
+        </w:rPr>
+        <w:t xml:space="preserve">│   │   │   │       ├── </w:t>
+      </w:r>
+      <w:r>
+        <w:rPr>
+          <w:rFonts w:ascii="Segoe UI Emoji" w:hAnsi="Segoe UI Emoji" w:cs="Segoe UI Emoji"/>
+          <w:lang w:val="en-US"/>
+        </w:rPr>
+        <w:t>📁</w:t>
+      </w:r>
+      <w:r>
+        <w:rPr>
+          <w:lang w:val="en-US"/>
+        </w:rPr>
+        <w:t xml:space="preserve"> dto/           # Data Transfer Objects</w:t>
+      </w:r>
+    </w:p>
+    <w:p>
+      <w:pPr>
+        <w:rPr>
+          <w:lang w:val="en-US"/>
+        </w:rPr>
+      </w:pPr>
+      <w:r>
+        <w:rPr>
+          <w:lang w:val="en-US"/>
+        </w:rPr>
+        <w:t xml:space="preserve">│   │   │   │       │   ├── </w:t>
+      </w:r>
+      <w:r>
+        <w:rPr>
+          <w:rFonts w:ascii="Segoe UI Emoji" w:hAnsi="Segoe UI Emoji" w:cs="Segoe UI Emoji"/>
+          <w:lang w:val="en-US"/>
+        </w:rPr>
+        <w:t>📁</w:t>
+      </w:r>
+      <w:r>
+        <w:rPr>
+          <w:lang w:val="en-US"/>
+        </w:rPr>
+        <w:t xml:space="preserve"> request/</w:t>
+      </w:r>
+    </w:p>
+    <w:p>
+      <w:pPr>
+        <w:rPr>
+          <w:lang w:val="en-US"/>
+        </w:rPr>
+      </w:pPr>
+      <w:r>
+        <w:rPr>
+          <w:lang w:val="en-US"/>
+        </w:rPr>
+        <w:t xml:space="preserve">│   │   │   │       │   ├── </w:t>
+      </w:r>
+      <w:r>
+        <w:rPr>
+          <w:rFonts w:ascii="Segoe UI Emoji" w:hAnsi="Segoe UI Emoji" w:cs="Segoe UI Emoji"/>
+          <w:lang w:val="en-US"/>
+        </w:rPr>
+        <w:t>📁</w:t>
+      </w:r>
+      <w:r>
+        <w:rPr>
+          <w:lang w:val="en-US"/>
+        </w:rPr>
+        <w:t xml:space="preserve"> response/</w:t>
+      </w:r>
+    </w:p>
+    <w:p>
+      <w:pPr>
+        <w:rPr>
+          <w:lang w:val="en-US"/>
+        </w:rPr>
+      </w:pPr>
+      <w:r>
+        <w:rPr>
+          <w:lang w:val="en-US"/>
+        </w:rPr>
+        <w:t xml:space="preserve">│   │   │   │       │   └── </w:t>
+      </w:r>
+      <w:r>
+        <w:rPr>
+          <w:rFonts w:ascii="Segoe UI Emoji" w:hAnsi="Segoe UI Emoji" w:cs="Segoe UI Emoji"/>
+          <w:lang w:val="en-US"/>
+        </w:rPr>
+        <w:t>📁</w:t>
+      </w:r>
+      <w:r>
+        <w:rPr>
+          <w:lang w:val="en-US"/>
+        </w:rPr>
+        <w:t xml:space="preserve"> internal/</w:t>
+      </w:r>
+    </w:p>
+    <w:p>
+      <w:pPr>
+        <w:rPr>
+          <w:lang w:val="en-US"/>
+        </w:rPr>
+      </w:pPr>
+      <w:r>
+        <w:rPr>
+          <w:lang w:val="en-US"/>
+        </w:rPr>
+        <w:t xml:space="preserve">│   │   │   │       ├── </w:t>
+      </w:r>
+      <w:r>
+        <w:rPr>
+          <w:rFonts w:ascii="Segoe UI Emoji" w:hAnsi="Segoe UI Emoji" w:cs="Segoe UI Emoji"/>
+          <w:lang w:val="en-US"/>
+        </w:rPr>
+        <w:t>📁</w:t>
+      </w:r>
+      <w:r>
+        <w:rPr>
+          <w:lang w:val="en-US"/>
+        </w:rPr>
+        <w:t xml:space="preserve"> exceptions/   # Global Exception Handling</w:t>
+      </w:r>
+    </w:p>
+    <w:p>
+      <w:pPr>
+        <w:rPr>
+          <w:lang w:val="en-US"/>
+        </w:rPr>
+      </w:pPr>
+      <w:r>
+        <w:rPr>
+          <w:lang w:val="en-US"/>
+        </w:rPr>
+        <w:t xml:space="preserve">│   │   │   │       ├── </w:t>
+      </w:r>
+      <w:r>
+        <w:rPr>
+          <w:rFonts w:ascii="Segoe UI Emoji" w:hAnsi="Segoe UI Emoji" w:cs="Segoe UI Emoji"/>
+          <w:lang w:val="en-US"/>
+        </w:rPr>
+        <w:t>📁</w:t>
+      </w:r>
+      <w:r>
+        <w:rPr>
+          <w:lang w:val="en-US"/>
+        </w:rPr>
+        <w:t xml:space="preserve"> model/         # Entity &amp; Enum</w:t>
+      </w:r>
+    </w:p>
+    <w:p>
+      <w:pPr>
+        <w:rPr>
+          <w:lang w:val="en-US"/>
+        </w:rPr>
+      </w:pPr>
+      <w:r>
+        <w:rPr>
+          <w:lang w:val="en-US"/>
+        </w:rPr>
+        <w:t xml:space="preserve">│   │   │   │       │   └── </w:t>
+      </w:r>
+      <w:r>
+        <w:rPr>
+          <w:rFonts w:ascii="Segoe UI Emoji" w:hAnsi="Segoe UI Emoji" w:cs="Segoe UI Emoji"/>
+          <w:lang w:val="en-US"/>
+        </w:rPr>
+        <w:t>📁</w:t>
+      </w:r>
+      <w:r>
+        <w:rPr>
+          <w:lang w:val="en-US"/>
+        </w:rPr>
+        <w:t xml:space="preserve"> enums/</w:t>
+      </w:r>
+    </w:p>
+    <w:p>
+      <w:pPr>
+        <w:rPr>
+          <w:lang w:val="en-US"/>
+        </w:rPr>
+      </w:pPr>
+      <w:r>
+        <w:rPr>
+          <w:lang w:val="en-US"/>
+        </w:rPr>
+        <w:t xml:space="preserve">│   │   │   │       ├── </w:t>
+      </w:r>
+      <w:r>
+        <w:rPr>
+          <w:rFonts w:ascii="Segoe UI Emoji" w:hAnsi="Segoe UI Emoji" w:cs="Segoe UI Emoji"/>
+          <w:lang w:val="en-US"/>
+        </w:rPr>
+        <w:t>📁</w:t>
+      </w:r>
+      <w:r>
+        <w:rPr>
+          <w:lang w:val="en-US"/>
+        </w:rPr>
+        <w:t xml:space="preserve"> repository/   # JPA Repository Interfaces</w:t>
+      </w:r>
+    </w:p>
+    <w:p>
+      <w:pPr>
+        <w:rPr>
+          <w:lang w:val="en-US"/>
+        </w:rPr>
+      </w:pPr>
+      <w:r>
+        <w:rPr>
+          <w:lang w:val="en-US"/>
+        </w:rPr>
+        <w:t xml:space="preserve">│   │   │   │       ├── </w:t>
+      </w:r>
+      <w:r>
+        <w:rPr>
+          <w:rFonts w:ascii="Segoe UI Emoji" w:hAnsi="Segoe UI Emoji" w:cs="Segoe UI Emoji"/>
+          <w:lang w:val="en-US"/>
+        </w:rPr>
+        <w:t>📁</w:t>
+      </w:r>
+      <w:r>
+        <w:rPr>
+          <w:lang w:val="en-US"/>
+        </w:rPr>
+        <w:t xml:space="preserve"> service/       # Business Logic</w:t>
+      </w:r>
+    </w:p>
+    <w:p>
+      <w:pPr>
+        <w:rPr>
+          <w:lang w:val="en-US"/>
+        </w:rPr>
+      </w:pPr>
+      <w:r>
+        <w:rPr>
+          <w:lang w:val="en-US"/>
+        </w:rPr>
+        <w:t xml:space="preserve">│   │   │   │       │   ├── </w:t>
+      </w:r>
+      <w:r>
+        <w:rPr>
+          <w:rFonts w:ascii="Segoe UI Emoji" w:hAnsi="Segoe UI Emoji" w:cs="Segoe UI Emoji"/>
+          <w:lang w:val="en-US"/>
+        </w:rPr>
+        <w:t>📁</w:t>
+      </w:r>
+      <w:r>
+        <w:rPr>
+          <w:lang w:val="en-US"/>
+        </w:rPr>
+        <w:t xml:space="preserve"> auth/      # Authentication &amp; JWT Service</w:t>
+      </w:r>
+    </w:p>
+    <w:p>
+      <w:pPr>
+        <w:rPr>
+          <w:lang w:val="en-US"/>
+        </w:rPr>
+      </w:pPr>
+      <w:r>
+        <w:rPr>
+          <w:lang w:val="en-US"/>
+        </w:rPr>
+        <w:t xml:space="preserve">│   │   │   │       │   ├── </w:t>
+      </w:r>
+      <w:r>
+        <w:rPr>
+          <w:rFonts w:ascii="Segoe UI Emoji" w:hAnsi="Segoe UI Emoji" w:cs="Segoe UI Emoji"/>
+          <w:lang w:val="en-US"/>
+        </w:rPr>
+        <w:t>📁</w:t>
+      </w:r>
+      <w:r>
+        <w:rPr>
+          <w:lang w:val="en-US"/>
+        </w:rPr>
+        <w:t xml:space="preserve"> impl/      # Service Implementations</w:t>
+      </w:r>
+    </w:p>
+    <w:p>
+      <w:pPr>
+        <w:rPr>
+          <w:lang w:val="en-US"/>
+        </w:rPr>
+      </w:pPr>
+      <w:r>
+        <w:rPr>
+          <w:lang w:val="en-US"/>
+        </w:rPr>
+        <w:t xml:space="preserve">│   │   │   │       │   └── </w:t>
+      </w:r>
+      <w:r>
+        <w:rPr>
+          <w:rFonts w:ascii="Segoe UI Emoji" w:hAnsi="Segoe UI Emoji" w:cs="Segoe UI Emoji"/>
+          <w:lang w:val="en-US"/>
+        </w:rPr>
+        <w:t>📁</w:t>
+      </w:r>
+      <w:r>
+        <w:rPr>
+          <w:lang w:val="en-US"/>
+        </w:rPr>
+        <w:t xml:space="preserve"> utils/     # Helper &amp; Utils</w:t>
+      </w:r>
+    </w:p>
+    <w:p>
+      <w:pPr>
+        <w:rPr>
+          <w:lang w:val="en-US"/>
+        </w:rPr>
+      </w:pPr>
+      <w:r>
+        <w:rPr>
+          <w:lang w:val="en-US"/>
+        </w:rPr>
+        <w:t xml:space="preserve">│   │   │   └── </w:t>
+      </w:r>
+      <w:r>
+        <w:rPr>
+          <w:rFonts w:ascii="Segoe UI Emoji" w:hAnsi="Segoe UI Emoji" w:cs="Segoe UI Emoji"/>
+          <w:lang w:val="en-US"/>
+        </w:rPr>
+        <w:t>📁</w:t>
+      </w:r>
+      <w:r>
+        <w:rPr>
+          <w:lang w:val="en-US"/>
+        </w:rPr>
+        <w:t xml:space="preserve"> resources/             # application.properties</w:t>
+      </w:r>
+    </w:p>
+    <w:p>
+      <w:pPr>
+        <w:rPr>
+          <w:lang w:val="en-US"/>
+        </w:rPr>
+      </w:pPr>
+      <w:r>
+        <w:rPr>
+          <w:lang w:val="en-US"/>
+        </w:rPr>
+        <w:t xml:space="preserve">│   │   └── </w:t>
+      </w:r>
+      <w:r>
+        <w:rPr>
+          <w:rFonts w:ascii="Segoe UI Emoji" w:hAnsi="Segoe UI Emoji" w:cs="Segoe UI Emoji"/>
+          <w:lang w:val="en-US"/>
+        </w:rPr>
+        <w:t>📁</w:t>
+      </w:r>
+      <w:r>
+        <w:rPr>
+          <w:lang w:val="en-US"/>
+        </w:rPr>
+        <w:t xml:space="preserve"> test/</w:t>
+      </w:r>
+    </w:p>
+    <w:p>
+      <w:pPr>
+        <w:rPr>
+          <w:lang w:val="en-US"/>
+        </w:rPr>
+      </w:pPr>
+      <w:r>
+        <w:rPr>
+          <w:lang w:val="en-US"/>
+        </w:rPr>
+        <w:t xml:space="preserve">│   ├── </w:t>
+      </w:r>
+      <w:r>
+        <w:rPr>
+          <w:rFonts w:ascii="Segoe UI Emoji" w:hAnsi="Segoe UI Emoji" w:cs="Segoe UI Emoji"/>
+          <w:lang w:val="en-US"/>
+        </w:rPr>
+        <w:t>📁</w:t>
+      </w:r>
+      <w:r>
+        <w:rPr>
+          <w:lang w:val="en-US"/>
+        </w:rPr>
+        <w:t xml:space="preserve"> .mvn/</w:t>
+      </w:r>
+    </w:p>
+    <w:p>
+      <w:pPr>
+        <w:rPr>
+          <w:lang w:val="en-US"/>
+        </w:rPr>
+      </w:pPr>
+      <w:r>
+        <w:rPr>
+          <w:lang w:val="en-US"/>
+        </w:rPr>
+        <w:t xml:space="preserve">│   └── </w:t>
+      </w:r>
+      <w:r>
+        <w:rPr>
+          <w:rFonts w:ascii="Segoe UI Emoji" w:hAnsi="Segoe UI Emoji" w:cs="Segoe UI Emoji"/>
+          <w:lang w:val="en-US"/>
+        </w:rPr>
+        <w:t>📁</w:t>
+      </w:r>
+      <w:r>
+        <w:rPr>
+          <w:lang w:val="en-US"/>
+        </w:rPr>
+        <w:t xml:space="preserve"> uploads/</w:t>
+      </w:r>
+    </w:p>
+    <w:p>
+      <w:pPr>
+        <w:rPr>
+          <w:lang w:val="en-US"/>
+        </w:rPr>
+      </w:pPr>
+      <w:r>
+        <w:rPr>
+          <w:lang w:val="en-US"/>
+        </w:rPr>
+        <w:t>│</w:t>
+      </w:r>
+    </w:p>
+    <w:p>
+      <w:pPr>
+        <w:rPr>
+          <w:lang w:val="en-US"/>
+        </w:rPr>
+      </w:pPr>
+      <w:r>
+        <w:rPr>
+          <w:lang w:val="en-US"/>
+        </w:rPr>
+        <w:t xml:space="preserve">├── </w:t>
+      </w:r>
+      <w:r>
+        <w:rPr>
+          <w:rFonts w:ascii="Segoe UI Emoji" w:hAnsi="Segoe UI Emoji" w:cs="Segoe UI Emoji"/>
+          <w:lang w:val="en-US"/>
+        </w:rPr>
+        <w:t>📁</w:t>
+      </w:r>
+      <w:r>
+        <w:rPr>
+          <w:lang w:val="en-US"/>
+        </w:rPr>
+        <w:t xml:space="preserve"> frontend/                        # Frontend - React + TypeScript</w:t>
+      </w:r>
+    </w:p>
+    <w:p>
+      <w:pPr>
+        <w:rPr>
+          <w:lang w:val="en-US"/>
+        </w:rPr>
+      </w:pPr>
+      <w:r>
+        <w:rPr>
+          <w:lang w:val="en-US"/>
+        </w:rPr>
+        <w:t xml:space="preserve">│   ├── </w:t>
+      </w:r>
+      <w:r>
+        <w:rPr>
+          <w:rFonts w:ascii="Segoe UI Emoji" w:hAnsi="Segoe UI Emoji" w:cs="Segoe UI Emoji"/>
+          <w:lang w:val="en-US"/>
+        </w:rPr>
+        <w:t>📁</w:t>
+      </w:r>
+      <w:r>
+        <w:rPr>
+          <w:lang w:val="en-US"/>
+        </w:rPr>
+        <w:t xml:space="preserve"> public/</w:t>
+      </w:r>
+    </w:p>
+    <w:p>
+      <w:pPr>
+        <w:rPr>
+          <w:lang w:val="en-US"/>
+        </w:rPr>
+      </w:pPr>
+      <w:r>
+        <w:rPr>
+          <w:lang w:val="en-US"/>
+        </w:rPr>
+        <w:t xml:space="preserve">│   ├── </w:t>
+      </w:r>
+      <w:r>
+        <w:rPr>
+          <w:rFonts w:ascii="Segoe UI Emoji" w:hAnsi="Segoe UI Emoji" w:cs="Segoe UI Emoji"/>
+          <w:lang w:val="en-US"/>
+        </w:rPr>
+        <w:t>📁</w:t>
+      </w:r>
+      <w:r>
+        <w:rPr>
+          <w:lang w:val="en-US"/>
+        </w:rPr>
+        <w:t xml:space="preserve"> src/</w:t>
+      </w:r>
+    </w:p>
+    <w:p>
+      <w:pPr>
+        <w:rPr>
+          <w:lang w:val="en-US"/>
+        </w:rPr>
+      </w:pPr>
+      <w:r>
+        <w:rPr>
+          <w:lang w:val="en-US"/>
+        </w:rPr>
+        <w:t xml:space="preserve">│   │   ├── </w:t>
+      </w:r>
+      <w:r>
+        <w:rPr>
+          <w:rFonts w:ascii="Segoe UI Emoji" w:hAnsi="Segoe UI Emoji" w:cs="Segoe UI Emoji"/>
+          <w:lang w:val="en-US"/>
+        </w:rPr>
+        <w:t>📁</w:t>
+      </w:r>
+      <w:r>
+        <w:rPr>
+          <w:lang w:val="en-US"/>
+        </w:rPr>
+        <w:t xml:space="preserve"> components/              # UI Components</w:t>
+      </w:r>
+    </w:p>
+    <w:p>
+      <w:pPr>
+        <w:rPr>
+          <w:lang w:val="en-US"/>
+        </w:rPr>
+      </w:pPr>
+      <w:r>
+        <w:rPr>
+          <w:lang w:val="en-US"/>
+        </w:rPr>
+        <w:t xml:space="preserve">│   │   │   ├── </w:t>
+      </w:r>
+      <w:r>
+        <w:rPr>
+          <w:rFonts w:ascii="Segoe UI Emoji" w:hAnsi="Segoe UI Emoji" w:cs="Segoe UI Emoji"/>
+          <w:lang w:val="en-US"/>
+        </w:rPr>
+        <w:t>📁</w:t>
+      </w:r>
+      <w:r>
+        <w:rPr>
+          <w:lang w:val="en-US"/>
+        </w:rPr>
+        <w:t xml:space="preserve"> common/</w:t>
+      </w:r>
+    </w:p>
+    <w:p>
+      <w:pPr>
+        <w:rPr>
+          <w:lang w:val="en-US"/>
+        </w:rPr>
+      </w:pPr>
+      <w:r>
+        <w:rPr>
+          <w:lang w:val="en-US"/>
+        </w:rPr>
+        <w:t xml:space="preserve">│   │   │   ├── </w:t>
+      </w:r>
+      <w:r>
+        <w:rPr>
+          <w:rFonts w:ascii="Segoe UI Emoji" w:hAnsi="Segoe UI Emoji" w:cs="Segoe UI Emoji"/>
+          <w:lang w:val="en-US"/>
+        </w:rPr>
+        <w:t>📁</w:t>
+      </w:r>
+      <w:r>
+        <w:rPr>
+          <w:lang w:val="en-US"/>
+        </w:rPr>
+        <w:t xml:space="preserve"> inbound/</w:t>
+      </w:r>
+    </w:p>
+    <w:p>
+      <w:pPr>
+        <w:rPr>
+          <w:lang w:val="en-US"/>
+        </w:rPr>
+      </w:pPr>
+      <w:r>
+        <w:rPr>
+          <w:lang w:val="en-US"/>
+        </w:rPr>
+        <w:t xml:space="preserve">│   │   │   ├── </w:t>
+      </w:r>
+      <w:r>
+        <w:rPr>
+          <w:rFonts w:ascii="Segoe UI Emoji" w:hAnsi="Segoe UI Emoji" w:cs="Segoe UI Emoji"/>
+          <w:lang w:val="en-US"/>
+        </w:rPr>
+        <w:t>📁</w:t>
+      </w:r>
+      <w:r>
+        <w:rPr>
+          <w:lang w:val="en-US"/>
+        </w:rPr>
+        <w:t xml:space="preserve"> outbound/</w:t>
+      </w:r>
+    </w:p>
+    <w:p>
+      <w:pPr>
+        <w:rPr>
+          <w:lang w:val="en-US"/>
+        </w:rPr>
+      </w:pPr>
+      <w:r>
+        <w:rPr>
+          <w:lang w:val="en-US"/>
+        </w:rPr>
+        <w:t xml:space="preserve">│   │   │   ├── </w:t>
+      </w:r>
+      <w:r>
+        <w:rPr>
+          <w:rFonts w:ascii="Segoe UI Emoji" w:hAnsi="Segoe UI Emoji" w:cs="Segoe UI Emoji"/>
+          <w:lang w:val="en-US"/>
+        </w:rPr>
+        <w:t>📁</w:t>
+      </w:r>
+      <w:r>
+        <w:rPr>
+          <w:lang w:val="en-US"/>
+        </w:rPr>
+        <w:t xml:space="preserve"> scanner/</w:t>
+      </w:r>
+    </w:p>
+    <w:p>
+      <w:pPr>
+        <w:rPr>
+          <w:lang w:val="en-US"/>
+        </w:rPr>
+      </w:pPr>
+      <w:r>
+        <w:rPr>
+          <w:lang w:val="en-US"/>
+        </w:rPr>
+        <w:t xml:space="preserve">│   │   │   ├── </w:t>
+      </w:r>
+      <w:r>
+        <w:rPr>
+          <w:rFonts w:ascii="Segoe UI Emoji" w:hAnsi="Segoe UI Emoji" w:cs="Segoe UI Emoji"/>
+          <w:lang w:val="en-US"/>
+        </w:rPr>
+        <w:t>📁</w:t>
+      </w:r>
+      <w:r>
+        <w:rPr>
+          <w:lang w:val="en-US"/>
+        </w:rPr>
+        <w:t xml:space="preserve"> layout/               # Layout theo role</w:t>
+      </w:r>
+    </w:p>
+    <w:p>
+      <w:pPr>
+        <w:rPr>
+          <w:lang w:val="en-US"/>
+        </w:rPr>
+      </w:pPr>
+      <w:r>
+        <w:rPr>
+          <w:lang w:val="en-US"/>
+        </w:rPr>
+        <w:t xml:space="preserve">│   │   │   │   ├── </w:t>
+      </w:r>
+      <w:r>
+        <w:rPr>
+          <w:rFonts w:ascii="Segoe UI Emoji" w:hAnsi="Segoe UI Emoji" w:cs="Segoe UI Emoji"/>
+          <w:lang w:val="en-US"/>
+        </w:rPr>
+        <w:t>📁</w:t>
+      </w:r>
+      <w:r>
+        <w:rPr>
+          <w:lang w:val="en-US"/>
+        </w:rPr>
+        <w:t xml:space="preserve"> Admin/</w:t>
+      </w:r>
+    </w:p>
+    <w:p>
+      <w:pPr>
+        <w:rPr>
+          <w:lang w:val="en-US"/>
+        </w:rPr>
+      </w:pPr>
+      <w:r>
+        <w:rPr>
+          <w:lang w:val="en-US"/>
+        </w:rPr>
+        <w:t xml:space="preserve">│   │   │   │   ├── </w:t>
+      </w:r>
+      <w:r>
+        <w:rPr>
+          <w:rFonts w:ascii="Segoe UI Emoji" w:hAnsi="Segoe UI Emoji" w:cs="Segoe UI Emoji"/>
+          <w:lang w:val="en-US"/>
+        </w:rPr>
+        <w:t>📁</w:t>
+      </w:r>
+      <w:r>
+        <w:rPr>
+          <w:lang w:val="en-US"/>
+        </w:rPr>
+        <w:t xml:space="preserve"> Manager/</w:t>
+      </w:r>
+    </w:p>
+    <w:p>
+      <w:pPr>
+        <w:rPr>
+          <w:lang w:val="en-US"/>
+        </w:rPr>
+      </w:pPr>
+      <w:r>
+        <w:rPr>
+          <w:lang w:val="en-US"/>
+        </w:rPr>
+        <w:lastRenderedPageBreak/>
+        <w:t xml:space="preserve">│   │   │   │   ├── </w:t>
+      </w:r>
+      <w:r>
+        <w:rPr>
+          <w:rFonts w:ascii="Segoe UI Emoji" w:hAnsi="Segoe UI Emoji" w:cs="Segoe UI Emoji"/>
+          <w:lang w:val="en-US"/>
+        </w:rPr>
+        <w:t>📁</w:t>
+      </w:r>
+      <w:r>
+        <w:rPr>
+          <w:lang w:val="en-US"/>
+        </w:rPr>
+        <w:t xml:space="preserve"> Staff/</w:t>
+      </w:r>
+    </w:p>
+    <w:p>
+      <w:pPr>
+        <w:rPr>
+          <w:lang w:val="en-US"/>
+        </w:rPr>
+      </w:pPr>
+      <w:r>
+        <w:rPr>
+          <w:lang w:val="en-US"/>
+        </w:rPr>
+        <w:t xml:space="preserve">│   │   │   │   └── </w:t>
+      </w:r>
+      <w:r>
+        <w:rPr>
+          <w:rFonts w:ascii="Segoe UI Emoji" w:hAnsi="Segoe UI Emoji" w:cs="Segoe UI Emoji"/>
+          <w:lang w:val="en-US"/>
+        </w:rPr>
+        <w:t>📁</w:t>
+      </w:r>
+      <w:r>
+        <w:rPr>
+          <w:lang w:val="en-US"/>
+        </w:rPr>
+        <w:t xml:space="preserve"> Accountant/</w:t>
+      </w:r>
+    </w:p>
+    <w:p>
+      <w:pPr>
+        <w:rPr>
+          <w:lang w:val="en-US"/>
+        </w:rPr>
+      </w:pPr>
+      <w:r>
+        <w:rPr>
+          <w:lang w:val="en-US"/>
+        </w:rPr>
+        <w:t xml:space="preserve">│   │   │   └── </w:t>
+      </w:r>
+      <w:r>
+        <w:rPr>
+          <w:rFonts w:ascii="Segoe UI Emoji" w:hAnsi="Segoe UI Emoji" w:cs="Segoe UI Emoji"/>
+          <w:lang w:val="en-US"/>
+        </w:rPr>
+        <w:t>📁</w:t>
+      </w:r>
+      <w:r>
+        <w:rPr>
+          <w:lang w:val="en-US"/>
+        </w:rPr>
+        <w:t xml:space="preserve"> ui/                   # Shadcn/UI components</w:t>
+      </w:r>
+    </w:p>
+    <w:p>
+      <w:pPr>
+        <w:rPr>
+          <w:lang w:val="en-US"/>
+        </w:rPr>
+      </w:pPr>
+      <w:r>
+        <w:rPr>
+          <w:lang w:val="en-US"/>
+        </w:rPr>
+        <w:t xml:space="preserve">│   │   ├── </w:t>
+      </w:r>
+      <w:r>
+        <w:rPr>
+          <w:rFonts w:ascii="Segoe UI Emoji" w:hAnsi="Segoe UI Emoji" w:cs="Segoe UI Emoji"/>
+          <w:lang w:val="en-US"/>
+        </w:rPr>
+        <w:t>📁</w:t>
+      </w:r>
+      <w:r>
+        <w:rPr>
+          <w:lang w:val="en-US"/>
+        </w:rPr>
+        <w:t xml:space="preserve"> hooks/                   # Custom React Hooks</w:t>
+      </w:r>
+    </w:p>
+    <w:p>
+      <w:pPr>
+        <w:rPr>
+          <w:lang w:val="en-US"/>
+        </w:rPr>
+      </w:pPr>
+      <w:r>
+        <w:rPr>
+          <w:lang w:val="en-US"/>
+        </w:rPr>
+        <w:t xml:space="preserve">│   │   ├── </w:t>
+      </w:r>
+      <w:r>
+        <w:rPr>
+          <w:rFonts w:ascii="Segoe UI Emoji" w:hAnsi="Segoe UI Emoji" w:cs="Segoe UI Emoji"/>
+          <w:lang w:val="en-US"/>
+        </w:rPr>
+        <w:t>📁</w:t>
+      </w:r>
+      <w:r>
+        <w:rPr>
+          <w:lang w:val="en-US"/>
+        </w:rPr>
+        <w:t xml:space="preserve"> pages/                   # Các màn hình chức năng</w:t>
+      </w:r>
+    </w:p>
+    <w:p>
+      <w:pPr>
+        <w:rPr>
+          <w:lang w:val="en-US"/>
+        </w:rPr>
+      </w:pPr>
+      <w:r>
+        <w:rPr>
+          <w:lang w:val="en-US"/>
+        </w:rPr>
+        <w:t xml:space="preserve">│   │   │   ├── </w:t>
+      </w:r>
+      <w:r>
+        <w:rPr>
+          <w:rFonts w:ascii="Segoe UI Emoji" w:hAnsi="Segoe UI Emoji" w:cs="Segoe UI Emoji"/>
+          <w:lang w:val="en-US"/>
+        </w:rPr>
+        <w:t>📁</w:t>
+      </w:r>
+      <w:r>
+        <w:rPr>
+          <w:lang w:val="en-US"/>
+        </w:rPr>
+        <w:t xml:space="preserve"> auth/</w:t>
+      </w:r>
+    </w:p>
+    <w:p>
+      <w:pPr>
+        <w:rPr>
+          <w:lang w:val="en-US"/>
+        </w:rPr>
+      </w:pPr>
+      <w:r>
+        <w:rPr>
+          <w:lang w:val="en-US"/>
+        </w:rPr>
+        <w:t xml:space="preserve">│   │   │   ├── </w:t>
+      </w:r>
+      <w:r>
+        <w:rPr>
+          <w:rFonts w:ascii="Segoe UI Emoji" w:hAnsi="Segoe UI Emoji" w:cs="Segoe UI Emoji"/>
+          <w:lang w:val="en-US"/>
+        </w:rPr>
+        <w:t>📁</w:t>
+      </w:r>
+      <w:r>
+        <w:rPr>
+          <w:lang w:val="en-US"/>
+        </w:rPr>
+        <w:t xml:space="preserve"> admin/</w:t>
+      </w:r>
+    </w:p>
+    <w:p>
+      <w:pPr>
+        <w:rPr>
+          <w:lang w:val="en-US"/>
+        </w:rPr>
+      </w:pPr>
+      <w:r>
+        <w:rPr>
+          <w:lang w:val="en-US"/>
+        </w:rPr>
+        <w:t xml:space="preserve">│   │   │   ├── </w:t>
+      </w:r>
+      <w:r>
+        <w:rPr>
+          <w:rFonts w:ascii="Segoe UI Emoji" w:hAnsi="Segoe UI Emoji" w:cs="Segoe UI Emoji"/>
+          <w:lang w:val="en-US"/>
+        </w:rPr>
+        <w:t>📁</w:t>
+      </w:r>
+      <w:r>
+        <w:rPr>
+          <w:lang w:val="en-US"/>
+        </w:rPr>
+        <w:t xml:space="preserve"> manager/</w:t>
+      </w:r>
+    </w:p>
+    <w:p>
+      <w:pPr>
+        <w:rPr>
+          <w:lang w:val="en-US"/>
+        </w:rPr>
+      </w:pPr>
+      <w:r>
+        <w:rPr>
+          <w:lang w:val="en-US"/>
+        </w:rPr>
+        <w:t xml:space="preserve">│   │   │   ├── </w:t>
+      </w:r>
+      <w:r>
+        <w:rPr>
+          <w:rFonts w:ascii="Segoe UI Emoji" w:hAnsi="Segoe UI Emoji" w:cs="Segoe UI Emoji"/>
+          <w:lang w:val="en-US"/>
+        </w:rPr>
+        <w:t>📁</w:t>
+      </w:r>
+      <w:r>
+        <w:rPr>
+          <w:lang w:val="en-US"/>
+        </w:rPr>
+        <w:t xml:space="preserve"> staff/</w:t>
+      </w:r>
+    </w:p>
+    <w:p>
+      <w:pPr>
+        <w:rPr>
+          <w:lang w:val="en-US"/>
+        </w:rPr>
+      </w:pPr>
+      <w:r>
+        <w:rPr>
+          <w:lang w:val="en-US"/>
+        </w:rPr>
+        <w:t xml:space="preserve">│   │   │   └── </w:t>
+      </w:r>
+      <w:r>
+        <w:rPr>
+          <w:rFonts w:ascii="Segoe UI Emoji" w:hAnsi="Segoe UI Emoji" w:cs="Segoe UI Emoji"/>
+          <w:lang w:val="en-US"/>
+        </w:rPr>
+        <w:t>📁</w:t>
+      </w:r>
+      <w:r>
+        <w:rPr>
+          <w:lang w:val="en-US"/>
+        </w:rPr>
+        <w:t xml:space="preserve"> accountant/</w:t>
+      </w:r>
+    </w:p>
+    <w:p>
+      <w:pPr>
+        <w:rPr>
+          <w:lang w:val="en-US"/>
+        </w:rPr>
+      </w:pPr>
+      <w:r>
+        <w:rPr>
+          <w:lang w:val="en-US"/>
+        </w:rPr>
+        <w:t xml:space="preserve">│   │   ├── </w:t>
+      </w:r>
+      <w:r>
+        <w:rPr>
+          <w:rFonts w:ascii="Segoe UI Emoji" w:hAnsi="Segoe UI Emoji" w:cs="Segoe UI Emoji"/>
+          <w:lang w:val="en-US"/>
+        </w:rPr>
+        <w:t>📁</w:t>
+      </w:r>
+      <w:r>
+        <w:rPr>
+          <w:lang w:val="en-US"/>
+        </w:rPr>
+        <w:t xml:space="preserve"> services/                # API Services</w:t>
+      </w:r>
+    </w:p>
+    <w:p>
+      <w:pPr>
+        <w:rPr>
+          <w:lang w:val="en-US"/>
+        </w:rPr>
+      </w:pPr>
+      <w:r>
+        <w:rPr>
+          <w:lang w:val="en-US"/>
+        </w:rPr>
+        <w:t xml:space="preserve">│   │   ├── </w:t>
+      </w:r>
+      <w:r>
+        <w:rPr>
+          <w:rFonts w:ascii="Segoe UI Emoji" w:hAnsi="Segoe UI Emoji" w:cs="Segoe UI Emoji"/>
+          <w:lang w:val="en-US"/>
+        </w:rPr>
+        <w:t>📁</w:t>
+      </w:r>
+      <w:r>
+        <w:rPr>
+          <w:lang w:val="en-US"/>
+        </w:rPr>
+        <w:t xml:space="preserve"> types/                   # TypeScript Types</w:t>
+      </w:r>
+    </w:p>
+    <w:p>
+      <w:pPr>
+        <w:rPr>
+          <w:lang w:val="en-US"/>
+        </w:rPr>
+      </w:pPr>
+      <w:r>
+        <w:rPr>
+          <w:lang w:val="en-US"/>
+        </w:rPr>
+        <w:t xml:space="preserve">│   │   ├── </w:t>
+      </w:r>
+      <w:r>
+        <w:rPr>
+          <w:rFonts w:ascii="Segoe UI Emoji" w:hAnsi="Segoe UI Emoji" w:cs="Segoe UI Emoji"/>
+          <w:lang w:val="en-US"/>
+        </w:rPr>
+        <w:t>📁</w:t>
+      </w:r>
+      <w:r>
+        <w:rPr>
+          <w:lang w:val="en-US"/>
+        </w:rPr>
+        <w:t xml:space="preserve"> utils/                   # Helper Functions</w:t>
+      </w:r>
+    </w:p>
+    <w:p>
+      <w:pPr>
+        <w:rPr>
+          <w:lang w:val="en-US"/>
+        </w:rPr>
+      </w:pPr>
+      <w:r>
+        <w:rPr>
+          <w:lang w:val="en-US"/>
+        </w:rPr>
+        <w:t xml:space="preserve">│   │   └── </w:t>
+      </w:r>
+      <w:r>
+        <w:rPr>
+          <w:rFonts w:ascii="Segoe UI Emoji" w:hAnsi="Segoe UI Emoji" w:cs="Segoe UI Emoji"/>
+          <w:lang w:val="en-US"/>
+        </w:rPr>
+        <w:t>📁</w:t>
+      </w:r>
+      <w:r>
+        <w:rPr>
+          <w:lang w:val="en-US"/>
+        </w:rPr>
+        <w:t xml:space="preserve"> lib/</w:t>
+      </w:r>
+    </w:p>
+    <w:p>
+      <w:pPr>
+        <w:rPr>
+          <w:lang w:val="en-US"/>
+        </w:rPr>
+      </w:pPr>
+      <w:r>
+        <w:rPr>
+          <w:lang w:val="en-US"/>
+        </w:rPr>
+        <w:t xml:space="preserve">│   └── </w:t>
+      </w:r>
+      <w:r>
+        <w:rPr>
+          <w:rFonts w:ascii="Segoe UI Emoji" w:hAnsi="Segoe UI Emoji" w:cs="Segoe UI Emoji"/>
+          <w:lang w:val="en-US"/>
+        </w:rPr>
+        <w:t>📁</w:t>
+      </w:r>
+      <w:r>
+        <w:rPr>
+          <w:lang w:val="en-US"/>
+        </w:rPr>
+        <w:t xml:space="preserve"> assets/</w:t>
+      </w:r>
+    </w:p>
+    <w:p>
+      <w:pPr>
+        <w:rPr>
+          <w:lang w:val="en-US"/>
+        </w:rPr>
+      </w:pPr>
+      <w:r>
+        <w:rPr>
+          <w:lang w:val="en-US"/>
+        </w:rPr>
+        <w:t>│</w:t>
+      </w:r>
+    </w:p>
+    <w:p>
+      <w:pPr>
+        <w:rPr>
+          <w:lang w:val="en-US"/>
+        </w:rPr>
+      </w:pPr>
+      <w:r>
+        <w:rPr>
+          <w:lang w:val="en-US"/>
+        </w:rPr>
+        <w:t xml:space="preserve">├── </w:t>
+      </w:r>
+      <w:r>
+        <w:rPr>
+          <w:rFonts w:ascii="Segoe UI Emoji" w:hAnsi="Segoe UI Emoji" w:cs="Segoe UI Emoji"/>
+          <w:lang w:val="en-US"/>
+        </w:rPr>
+        <w:t>📁</w:t>
+      </w:r>
+      <w:r>
+        <w:rPr>
+          <w:lang w:val="en-US"/>
+        </w:rPr>
+        <w:t xml:space="preserve"> database/                        # Database scripts</w:t>
+      </w:r>
+    </w:p>
+    <w:p>
+      <w:pPr>
+        <w:rPr>
+          <w:lang w:val="en-US"/>
+        </w:rPr>
+      </w:pPr>
+      <w:r>
+        <w:rPr>
+          <w:lang w:val="en-US"/>
+        </w:rPr>
+        <w:t>│</w:t>
+      </w:r>
+    </w:p>
+    <w:p>
+      <w:pPr>
+        <w:rPr>
+          <w:lang w:val="en-US"/>
+        </w:rPr>
+      </w:pPr>
+      <w:r>
+        <w:rPr>
+          <w:lang w:val="en-US"/>
+        </w:rPr>
+        <w:t xml:space="preserve">├── </w:t>
+      </w:r>
+      <w:r>
+        <w:rPr>
+          <w:rFonts w:ascii="Segoe UI Emoji" w:hAnsi="Segoe UI Emoji" w:cs="Segoe UI Emoji"/>
+          <w:lang w:val="en-US"/>
+        </w:rPr>
+        <w:t>📁</w:t>
+      </w:r>
+      <w:r>
+        <w:rPr>
+          <w:lang w:val="en-US"/>
+        </w:rPr>
+        <w:t xml:space="preserve"> uploads/                         # File upload (images, barcode…)</w:t>
+      </w:r>
+    </w:p>
+    <w:p>
+      <w:pPr>
+        <w:rPr>
+          <w:lang w:val="en-US"/>
+        </w:rPr>
+      </w:pPr>
+      <w:r>
+        <w:rPr>
+          <w:lang w:val="en-US"/>
+        </w:rPr>
+        <w:t>│</w:t>
+      </w:r>
+    </w:p>
+    <w:p>
+      <w:pPr>
+        <w:rPr>
+          <w:lang w:val="en-US"/>
+        </w:rPr>
+      </w:pPr>
+      <w:r>
+        <w:rPr>
+          <w:lang w:val="en-US"/>
+        </w:rPr>
+        <w:t xml:space="preserve">└── </w:t>
+      </w:r>
+      <w:r>
+        <w:rPr>
+          <w:rFonts w:ascii="Segoe UI Emoji" w:hAnsi="Segoe UI Emoji" w:cs="Segoe UI Emoji"/>
+          <w:lang w:val="en-US"/>
+        </w:rPr>
+        <w:t>📁</w:t>
+      </w:r>
+      <w:r>
+        <w:rPr>
+          <w:lang w:val="en-US"/>
+        </w:rPr>
+        <w:t xml:space="preserve"> docs/                            # Báo cáo, tài liệu (OOSD)</w:t>
+      </w:r>
     </w:p>
     <w:p>
       <w:pPr>
@@ -11610,7 +13588,7 @@
         <w:sz w:val="20"/>
       </w:rPr>
     </w:lvl>
-    <w:lvl w:ilvl="1" w:tentative="1">
+    <w:lvl w:ilvl="1">
       <w:start w:val="1"/>
       <w:numFmt w:val="bullet"/>
       <w:lvlText w:val="o"/>
@@ -13465,6 +15443,155 @@
     </w:lvl>
   </w:abstractNum>
   <w:abstractNum w:abstractNumId="22" w15:restartNumberingAfterBreak="0">
+    <w:nsid w:val="1954747E"/>
+    <w:multiLevelType w:val="multilevel"/>
+    <w:tmpl w:val="BF187F9A"/>
+    <w:lvl w:ilvl="0">
+      <w:start w:val="1"/>
+      <w:numFmt w:val="bullet"/>
+      <w:lvlText w:val=""/>
+      <w:lvlJc w:val="left"/>
+      <w:pPr>
+        <w:tabs>
+          <w:tab w:val="num" w:pos="720"/>
+        </w:tabs>
+        <w:ind w:left="720" w:hanging="360"/>
+      </w:pPr>
+      <w:rPr>
+        <w:rFonts w:ascii="Symbol" w:hAnsi="Symbol" w:hint="default"/>
+        <w:sz w:val="20"/>
+      </w:rPr>
+    </w:lvl>
+    <w:lvl w:ilvl="1" w:tentative="1">
+      <w:start w:val="1"/>
+      <w:numFmt w:val="bullet"/>
+      <w:lvlText w:val="o"/>
+      <w:lvlJc w:val="left"/>
+      <w:pPr>
+        <w:tabs>
+          <w:tab w:val="num" w:pos="1440"/>
+        </w:tabs>
+        <w:ind w:left="1440" w:hanging="360"/>
+      </w:pPr>
+      <w:rPr>
+        <w:rFonts w:ascii="Courier New" w:hAnsi="Courier New" w:hint="default"/>
+        <w:sz w:val="20"/>
+      </w:rPr>
+    </w:lvl>
+    <w:lvl w:ilvl="2" w:tentative="1">
+      <w:start w:val="1"/>
+      <w:numFmt w:val="bullet"/>
+      <w:lvlText w:val=""/>
+      <w:lvlJc w:val="left"/>
+      <w:pPr>
+        <w:tabs>
+          <w:tab w:val="num" w:pos="2160"/>
+        </w:tabs>
+        <w:ind w:left="2160" w:hanging="360"/>
+      </w:pPr>
+      <w:rPr>
+        <w:rFonts w:ascii="Wingdings" w:hAnsi="Wingdings" w:hint="default"/>
+        <w:sz w:val="20"/>
+      </w:rPr>
+    </w:lvl>
+    <w:lvl w:ilvl="3" w:tentative="1">
+      <w:start w:val="1"/>
+      <w:numFmt w:val="bullet"/>
+      <w:lvlText w:val=""/>
+      <w:lvlJc w:val="left"/>
+      <w:pPr>
+        <w:tabs>
+          <w:tab w:val="num" w:pos="2880"/>
+        </w:tabs>
+        <w:ind w:left="2880" w:hanging="360"/>
+      </w:pPr>
+      <w:rPr>
+        <w:rFonts w:ascii="Wingdings" w:hAnsi="Wingdings" w:hint="default"/>
+        <w:sz w:val="20"/>
+      </w:rPr>
+    </w:lvl>
+    <w:lvl w:ilvl="4" w:tentative="1">
+      <w:start w:val="1"/>
+      <w:numFmt w:val="bullet"/>
+      <w:lvlText w:val=""/>
+      <w:lvlJc w:val="left"/>
+      <w:pPr>
+        <w:tabs>
+          <w:tab w:val="num" w:pos="3600"/>
+        </w:tabs>
+        <w:ind w:left="3600" w:hanging="360"/>
+      </w:pPr>
+      <w:rPr>
+        <w:rFonts w:ascii="Wingdings" w:hAnsi="Wingdings" w:hint="default"/>
+        <w:sz w:val="20"/>
+      </w:rPr>
+    </w:lvl>
+    <w:lvl w:ilvl="5" w:tentative="1">
+      <w:start w:val="1"/>
+      <w:numFmt w:val="bullet"/>
+      <w:lvlText w:val=""/>
+      <w:lvlJc w:val="left"/>
+      <w:pPr>
+        <w:tabs>
+          <w:tab w:val="num" w:pos="4320"/>
+        </w:tabs>
+        <w:ind w:left="4320" w:hanging="360"/>
+      </w:pPr>
+      <w:rPr>
+        <w:rFonts w:ascii="Wingdings" w:hAnsi="Wingdings" w:hint="default"/>
+        <w:sz w:val="20"/>
+      </w:rPr>
+    </w:lvl>
+    <w:lvl w:ilvl="6" w:tentative="1">
+      <w:start w:val="1"/>
+      <w:numFmt w:val="bullet"/>
+      <w:lvlText w:val=""/>
+      <w:lvlJc w:val="left"/>
+      <w:pPr>
+        <w:tabs>
+          <w:tab w:val="num" w:pos="5040"/>
+        </w:tabs>
+        <w:ind w:left="5040" w:hanging="360"/>
+      </w:pPr>
+      <w:rPr>
+        <w:rFonts w:ascii="Wingdings" w:hAnsi="Wingdings" w:hint="default"/>
+        <w:sz w:val="20"/>
+      </w:rPr>
+    </w:lvl>
+    <w:lvl w:ilvl="7" w:tentative="1">
+      <w:start w:val="1"/>
+      <w:numFmt w:val="bullet"/>
+      <w:lvlText w:val=""/>
+      <w:lvlJc w:val="left"/>
+      <w:pPr>
+        <w:tabs>
+          <w:tab w:val="num" w:pos="5760"/>
+        </w:tabs>
+        <w:ind w:left="5760" w:hanging="360"/>
+      </w:pPr>
+      <w:rPr>
+        <w:rFonts w:ascii="Wingdings" w:hAnsi="Wingdings" w:hint="default"/>
+        <w:sz w:val="20"/>
+      </w:rPr>
+    </w:lvl>
+    <w:lvl w:ilvl="8" w:tentative="1">
+      <w:start w:val="1"/>
+      <w:numFmt w:val="bullet"/>
+      <w:lvlText w:val=""/>
+      <w:lvlJc w:val="left"/>
+      <w:pPr>
+        <w:tabs>
+          <w:tab w:val="num" w:pos="6480"/>
+        </w:tabs>
+        <w:ind w:left="6480" w:hanging="360"/>
+      </w:pPr>
+      <w:rPr>
+        <w:rFonts w:ascii="Wingdings" w:hAnsi="Wingdings" w:hint="default"/>
+        <w:sz w:val="20"/>
+      </w:rPr>
+    </w:lvl>
+  </w:abstractNum>
+  <w:abstractNum w:abstractNumId="23" w15:restartNumberingAfterBreak="0">
     <w:nsid w:val="1B291C89"/>
     <w:multiLevelType w:val="multilevel"/>
     <w:tmpl w:val="DD12AA54"/>
@@ -13613,7 +15740,7 @@
       </w:rPr>
     </w:lvl>
   </w:abstractNum>
-  <w:abstractNum w:abstractNumId="23" w15:restartNumberingAfterBreak="0">
+  <w:abstractNum w:abstractNumId="24" w15:restartNumberingAfterBreak="0">
     <w:nsid w:val="1CA76603"/>
     <w:multiLevelType w:val="multilevel"/>
     <w:tmpl w:val="95DA657E"/>
@@ -13762,7 +15889,7 @@
       </w:rPr>
     </w:lvl>
   </w:abstractNum>
-  <w:abstractNum w:abstractNumId="24" w15:restartNumberingAfterBreak="0">
+  <w:abstractNum w:abstractNumId="25" w15:restartNumberingAfterBreak="0">
     <w:nsid w:val="22526712"/>
     <w:multiLevelType w:val="multilevel"/>
     <w:tmpl w:val="CA80061A"/>
@@ -13911,7 +16038,7 @@
       </w:rPr>
     </w:lvl>
   </w:abstractNum>
-  <w:abstractNum w:abstractNumId="25" w15:restartNumberingAfterBreak="0">
+  <w:abstractNum w:abstractNumId="26" w15:restartNumberingAfterBreak="0">
     <w:nsid w:val="2313421F"/>
     <w:multiLevelType w:val="multilevel"/>
     <w:tmpl w:val="9F260CF2"/>
@@ -14060,7 +16187,7 @@
       </w:rPr>
     </w:lvl>
   </w:abstractNum>
-  <w:abstractNum w:abstractNumId="26" w15:restartNumberingAfterBreak="0">
+  <w:abstractNum w:abstractNumId="27" w15:restartNumberingAfterBreak="0">
     <w:nsid w:val="25BD7AD6"/>
     <w:multiLevelType w:val="multilevel"/>
     <w:tmpl w:val="902EC2F0"/>
@@ -14173,7 +16300,7 @@
       </w:pPr>
     </w:lvl>
   </w:abstractNum>
-  <w:abstractNum w:abstractNumId="27" w15:restartNumberingAfterBreak="0">
+  <w:abstractNum w:abstractNumId="28" w15:restartNumberingAfterBreak="0">
     <w:nsid w:val="280A41F2"/>
     <w:multiLevelType w:val="multilevel"/>
     <w:tmpl w:val="66D2E10A"/>
@@ -14322,7 +16449,305 @@
       </w:rPr>
     </w:lvl>
   </w:abstractNum>
-  <w:abstractNum w:abstractNumId="28" w15:restartNumberingAfterBreak="0">
+  <w:abstractNum w:abstractNumId="29" w15:restartNumberingAfterBreak="0">
+    <w:nsid w:val="288648D2"/>
+    <w:multiLevelType w:val="multilevel"/>
+    <w:tmpl w:val="AE86E0D4"/>
+    <w:lvl w:ilvl="0">
+      <w:start w:val="1"/>
+      <w:numFmt w:val="bullet"/>
+      <w:lvlText w:val=""/>
+      <w:lvlJc w:val="left"/>
+      <w:pPr>
+        <w:tabs>
+          <w:tab w:val="num" w:pos="720"/>
+        </w:tabs>
+        <w:ind w:left="720" w:hanging="360"/>
+      </w:pPr>
+      <w:rPr>
+        <w:rFonts w:ascii="Symbol" w:hAnsi="Symbol" w:hint="default"/>
+        <w:sz w:val="20"/>
+      </w:rPr>
+    </w:lvl>
+    <w:lvl w:ilvl="1" w:tentative="1">
+      <w:start w:val="1"/>
+      <w:numFmt w:val="bullet"/>
+      <w:lvlText w:val="o"/>
+      <w:lvlJc w:val="left"/>
+      <w:pPr>
+        <w:tabs>
+          <w:tab w:val="num" w:pos="1440"/>
+        </w:tabs>
+        <w:ind w:left="1440" w:hanging="360"/>
+      </w:pPr>
+      <w:rPr>
+        <w:rFonts w:ascii="Courier New" w:hAnsi="Courier New" w:hint="default"/>
+        <w:sz w:val="20"/>
+      </w:rPr>
+    </w:lvl>
+    <w:lvl w:ilvl="2" w:tentative="1">
+      <w:start w:val="1"/>
+      <w:numFmt w:val="bullet"/>
+      <w:lvlText w:val=""/>
+      <w:lvlJc w:val="left"/>
+      <w:pPr>
+        <w:tabs>
+          <w:tab w:val="num" w:pos="2160"/>
+        </w:tabs>
+        <w:ind w:left="2160" w:hanging="360"/>
+      </w:pPr>
+      <w:rPr>
+        <w:rFonts w:ascii="Wingdings" w:hAnsi="Wingdings" w:hint="default"/>
+        <w:sz w:val="20"/>
+      </w:rPr>
+    </w:lvl>
+    <w:lvl w:ilvl="3" w:tentative="1">
+      <w:start w:val="1"/>
+      <w:numFmt w:val="bullet"/>
+      <w:lvlText w:val=""/>
+      <w:lvlJc w:val="left"/>
+      <w:pPr>
+        <w:tabs>
+          <w:tab w:val="num" w:pos="2880"/>
+        </w:tabs>
+        <w:ind w:left="2880" w:hanging="360"/>
+      </w:pPr>
+      <w:rPr>
+        <w:rFonts w:ascii="Wingdings" w:hAnsi="Wingdings" w:hint="default"/>
+        <w:sz w:val="20"/>
+      </w:rPr>
+    </w:lvl>
+    <w:lvl w:ilvl="4" w:tentative="1">
+      <w:start w:val="1"/>
+      <w:numFmt w:val="bullet"/>
+      <w:lvlText w:val=""/>
+      <w:lvlJc w:val="left"/>
+      <w:pPr>
+        <w:tabs>
+          <w:tab w:val="num" w:pos="3600"/>
+        </w:tabs>
+        <w:ind w:left="3600" w:hanging="360"/>
+      </w:pPr>
+      <w:rPr>
+        <w:rFonts w:ascii="Wingdings" w:hAnsi="Wingdings" w:hint="default"/>
+        <w:sz w:val="20"/>
+      </w:rPr>
+    </w:lvl>
+    <w:lvl w:ilvl="5" w:tentative="1">
+      <w:start w:val="1"/>
+      <w:numFmt w:val="bullet"/>
+      <w:lvlText w:val=""/>
+      <w:lvlJc w:val="left"/>
+      <w:pPr>
+        <w:tabs>
+          <w:tab w:val="num" w:pos="4320"/>
+        </w:tabs>
+        <w:ind w:left="4320" w:hanging="360"/>
+      </w:pPr>
+      <w:rPr>
+        <w:rFonts w:ascii="Wingdings" w:hAnsi="Wingdings" w:hint="default"/>
+        <w:sz w:val="20"/>
+      </w:rPr>
+    </w:lvl>
+    <w:lvl w:ilvl="6" w:tentative="1">
+      <w:start w:val="1"/>
+      <w:numFmt w:val="bullet"/>
+      <w:lvlText w:val=""/>
+      <w:lvlJc w:val="left"/>
+      <w:pPr>
+        <w:tabs>
+          <w:tab w:val="num" w:pos="5040"/>
+        </w:tabs>
+        <w:ind w:left="5040" w:hanging="360"/>
+      </w:pPr>
+      <w:rPr>
+        <w:rFonts w:ascii="Wingdings" w:hAnsi="Wingdings" w:hint="default"/>
+        <w:sz w:val="20"/>
+      </w:rPr>
+    </w:lvl>
+    <w:lvl w:ilvl="7" w:tentative="1">
+      <w:start w:val="1"/>
+      <w:numFmt w:val="bullet"/>
+      <w:lvlText w:val=""/>
+      <w:lvlJc w:val="left"/>
+      <w:pPr>
+        <w:tabs>
+          <w:tab w:val="num" w:pos="5760"/>
+        </w:tabs>
+        <w:ind w:left="5760" w:hanging="360"/>
+      </w:pPr>
+      <w:rPr>
+        <w:rFonts w:ascii="Wingdings" w:hAnsi="Wingdings" w:hint="default"/>
+        <w:sz w:val="20"/>
+      </w:rPr>
+    </w:lvl>
+    <w:lvl w:ilvl="8" w:tentative="1">
+      <w:start w:val="1"/>
+      <w:numFmt w:val="bullet"/>
+      <w:lvlText w:val=""/>
+      <w:lvlJc w:val="left"/>
+      <w:pPr>
+        <w:tabs>
+          <w:tab w:val="num" w:pos="6480"/>
+        </w:tabs>
+        <w:ind w:left="6480" w:hanging="360"/>
+      </w:pPr>
+      <w:rPr>
+        <w:rFonts w:ascii="Wingdings" w:hAnsi="Wingdings" w:hint="default"/>
+        <w:sz w:val="20"/>
+      </w:rPr>
+    </w:lvl>
+  </w:abstractNum>
+  <w:abstractNum w:abstractNumId="30" w15:restartNumberingAfterBreak="0">
+    <w:nsid w:val="2E1E0249"/>
+    <w:multiLevelType w:val="multilevel"/>
+    <w:tmpl w:val="99060794"/>
+    <w:lvl w:ilvl="0">
+      <w:start w:val="1"/>
+      <w:numFmt w:val="bullet"/>
+      <w:lvlText w:val=""/>
+      <w:lvlJc w:val="left"/>
+      <w:pPr>
+        <w:tabs>
+          <w:tab w:val="num" w:pos="720"/>
+        </w:tabs>
+        <w:ind w:left="720" w:hanging="360"/>
+      </w:pPr>
+      <w:rPr>
+        <w:rFonts w:ascii="Symbol" w:hAnsi="Symbol" w:hint="default"/>
+        <w:sz w:val="20"/>
+      </w:rPr>
+    </w:lvl>
+    <w:lvl w:ilvl="1" w:tentative="1">
+      <w:start w:val="1"/>
+      <w:numFmt w:val="bullet"/>
+      <w:lvlText w:val="o"/>
+      <w:lvlJc w:val="left"/>
+      <w:pPr>
+        <w:tabs>
+          <w:tab w:val="num" w:pos="1440"/>
+        </w:tabs>
+        <w:ind w:left="1440" w:hanging="360"/>
+      </w:pPr>
+      <w:rPr>
+        <w:rFonts w:ascii="Courier New" w:hAnsi="Courier New" w:hint="default"/>
+        <w:sz w:val="20"/>
+      </w:rPr>
+    </w:lvl>
+    <w:lvl w:ilvl="2" w:tentative="1">
+      <w:start w:val="1"/>
+      <w:numFmt w:val="bullet"/>
+      <w:lvlText w:val=""/>
+      <w:lvlJc w:val="left"/>
+      <w:pPr>
+        <w:tabs>
+          <w:tab w:val="num" w:pos="2160"/>
+        </w:tabs>
+        <w:ind w:left="2160" w:hanging="360"/>
+      </w:pPr>
+      <w:rPr>
+        <w:rFonts w:ascii="Wingdings" w:hAnsi="Wingdings" w:hint="default"/>
+        <w:sz w:val="20"/>
+      </w:rPr>
+    </w:lvl>
+    <w:lvl w:ilvl="3" w:tentative="1">
+      <w:start w:val="1"/>
+      <w:numFmt w:val="bullet"/>
+      <w:lvlText w:val=""/>
+      <w:lvlJc w:val="left"/>
+      <w:pPr>
+        <w:tabs>
+          <w:tab w:val="num" w:pos="2880"/>
+        </w:tabs>
+        <w:ind w:left="2880" w:hanging="360"/>
+      </w:pPr>
+      <w:rPr>
+        <w:rFonts w:ascii="Wingdings" w:hAnsi="Wingdings" w:hint="default"/>
+        <w:sz w:val="20"/>
+      </w:rPr>
+    </w:lvl>
+    <w:lvl w:ilvl="4" w:tentative="1">
+      <w:start w:val="1"/>
+      <w:numFmt w:val="bullet"/>
+      <w:lvlText w:val=""/>
+      <w:lvlJc w:val="left"/>
+      <w:pPr>
+        <w:tabs>
+          <w:tab w:val="num" w:pos="3600"/>
+        </w:tabs>
+        <w:ind w:left="3600" w:hanging="360"/>
+      </w:pPr>
+      <w:rPr>
+        <w:rFonts w:ascii="Wingdings" w:hAnsi="Wingdings" w:hint="default"/>
+        <w:sz w:val="20"/>
+      </w:rPr>
+    </w:lvl>
+    <w:lvl w:ilvl="5" w:tentative="1">
+      <w:start w:val="1"/>
+      <w:numFmt w:val="bullet"/>
+      <w:lvlText w:val=""/>
+      <w:lvlJc w:val="left"/>
+      <w:pPr>
+        <w:tabs>
+          <w:tab w:val="num" w:pos="4320"/>
+        </w:tabs>
+        <w:ind w:left="4320" w:hanging="360"/>
+      </w:pPr>
+      <w:rPr>
+        <w:rFonts w:ascii="Wingdings" w:hAnsi="Wingdings" w:hint="default"/>
+        <w:sz w:val="20"/>
+      </w:rPr>
+    </w:lvl>
+    <w:lvl w:ilvl="6" w:tentative="1">
+      <w:start w:val="1"/>
+      <w:numFmt w:val="bullet"/>
+      <w:lvlText w:val=""/>
+      <w:lvlJc w:val="left"/>
+      <w:pPr>
+        <w:tabs>
+          <w:tab w:val="num" w:pos="5040"/>
+        </w:tabs>
+        <w:ind w:left="5040" w:hanging="360"/>
+      </w:pPr>
+      <w:rPr>
+        <w:rFonts w:ascii="Wingdings" w:hAnsi="Wingdings" w:hint="default"/>
+        <w:sz w:val="20"/>
+      </w:rPr>
+    </w:lvl>
+    <w:lvl w:ilvl="7" w:tentative="1">
+      <w:start w:val="1"/>
+      <w:numFmt w:val="bullet"/>
+      <w:lvlText w:val=""/>
+      <w:lvlJc w:val="left"/>
+      <w:pPr>
+        <w:tabs>
+          <w:tab w:val="num" w:pos="5760"/>
+        </w:tabs>
+        <w:ind w:left="5760" w:hanging="360"/>
+      </w:pPr>
+      <w:rPr>
+        <w:rFonts w:ascii="Wingdings" w:hAnsi="Wingdings" w:hint="default"/>
+        <w:sz w:val="20"/>
+      </w:rPr>
+    </w:lvl>
+    <w:lvl w:ilvl="8" w:tentative="1">
+      <w:start w:val="1"/>
+      <w:numFmt w:val="bullet"/>
+      <w:lvlText w:val=""/>
+      <w:lvlJc w:val="left"/>
+      <w:pPr>
+        <w:tabs>
+          <w:tab w:val="num" w:pos="6480"/>
+        </w:tabs>
+        <w:ind w:left="6480" w:hanging="360"/>
+      </w:pPr>
+      <w:rPr>
+        <w:rFonts w:ascii="Wingdings" w:hAnsi="Wingdings" w:hint="default"/>
+        <w:sz w:val="20"/>
+      </w:rPr>
+    </w:lvl>
+  </w:abstractNum>
+  <w:abstractNum w:abstractNumId="31" w15:restartNumberingAfterBreak="0">
     <w:nsid w:val="30B97590"/>
     <w:multiLevelType w:val="multilevel"/>
     <w:tmpl w:val="AFBADE32"/>
@@ -14471,7 +16896,7 @@
       </w:rPr>
     </w:lvl>
   </w:abstractNum>
-  <w:abstractNum w:abstractNumId="29" w15:restartNumberingAfterBreak="0">
+  <w:abstractNum w:abstractNumId="32" w15:restartNumberingAfterBreak="0">
     <w:nsid w:val="31C45952"/>
     <w:multiLevelType w:val="hybridMultilevel"/>
     <w:tmpl w:val="09B47848"/>
@@ -14584,7 +17009,7 @@
       </w:rPr>
     </w:lvl>
   </w:abstractNum>
-  <w:abstractNum w:abstractNumId="30" w15:restartNumberingAfterBreak="0">
+  <w:abstractNum w:abstractNumId="33" w15:restartNumberingAfterBreak="0">
     <w:nsid w:val="32CB64CE"/>
     <w:multiLevelType w:val="multilevel"/>
     <w:tmpl w:val="034A8154"/>
@@ -14733,7 +17158,7 @@
       </w:rPr>
     </w:lvl>
   </w:abstractNum>
-  <w:abstractNum w:abstractNumId="31" w15:restartNumberingAfterBreak="0">
+  <w:abstractNum w:abstractNumId="34" w15:restartNumberingAfterBreak="0">
     <w:nsid w:val="33800050"/>
     <w:multiLevelType w:val="multilevel"/>
     <w:tmpl w:val="78780C48"/>
@@ -14882,7 +17307,7 @@
       </w:rPr>
     </w:lvl>
   </w:abstractNum>
-  <w:abstractNum w:abstractNumId="32" w15:restartNumberingAfterBreak="0">
+  <w:abstractNum w:abstractNumId="35" w15:restartNumberingAfterBreak="0">
     <w:nsid w:val="39A9497A"/>
     <w:multiLevelType w:val="hybridMultilevel"/>
     <w:tmpl w:val="1B1C55EC"/>
@@ -14995,7 +17420,7 @@
       </w:rPr>
     </w:lvl>
   </w:abstractNum>
-  <w:abstractNum w:abstractNumId="33" w15:restartNumberingAfterBreak="0">
+  <w:abstractNum w:abstractNumId="36" w15:restartNumberingAfterBreak="0">
     <w:nsid w:val="3A9B797D"/>
     <w:multiLevelType w:val="multilevel"/>
     <w:tmpl w:val="E272C128"/>
@@ -15144,7 +17569,7 @@
       </w:rPr>
     </w:lvl>
   </w:abstractNum>
-  <w:abstractNum w:abstractNumId="34" w15:restartNumberingAfterBreak="0">
+  <w:abstractNum w:abstractNumId="37" w15:restartNumberingAfterBreak="0">
     <w:nsid w:val="3AC606E5"/>
     <w:multiLevelType w:val="multilevel"/>
     <w:tmpl w:val="55728E20"/>
@@ -15293,7 +17718,7 @@
       </w:rPr>
     </w:lvl>
   </w:abstractNum>
-  <w:abstractNum w:abstractNumId="35" w15:restartNumberingAfterBreak="0">
+  <w:abstractNum w:abstractNumId="38" w15:restartNumberingAfterBreak="0">
     <w:nsid w:val="3BEE5640"/>
     <w:multiLevelType w:val="multilevel"/>
     <w:tmpl w:val="145EDF04"/>
@@ -15442,7 +17867,7 @@
       </w:rPr>
     </w:lvl>
   </w:abstractNum>
-  <w:abstractNum w:abstractNumId="36" w15:restartNumberingAfterBreak="0">
+  <w:abstractNum w:abstractNumId="39" w15:restartNumberingAfterBreak="0">
     <w:nsid w:val="3CBD5F6E"/>
     <w:multiLevelType w:val="multilevel"/>
     <w:tmpl w:val="908839AC"/>
@@ -15591,7 +18016,7 @@
       </w:rPr>
     </w:lvl>
   </w:abstractNum>
-  <w:abstractNum w:abstractNumId="37" w15:restartNumberingAfterBreak="0">
+  <w:abstractNum w:abstractNumId="40" w15:restartNumberingAfterBreak="0">
     <w:nsid w:val="3FCC44D8"/>
     <w:multiLevelType w:val="multilevel"/>
     <w:tmpl w:val="94BEB1B6"/>
@@ -15740,7 +18165,7 @@
       </w:rPr>
     </w:lvl>
   </w:abstractNum>
-  <w:abstractNum w:abstractNumId="38" w15:restartNumberingAfterBreak="0">
+  <w:abstractNum w:abstractNumId="41" w15:restartNumberingAfterBreak="0">
     <w:nsid w:val="42CD74C8"/>
     <w:multiLevelType w:val="hybridMultilevel"/>
     <w:tmpl w:val="31C83C14"/>
@@ -15853,7 +18278,7 @@
       </w:rPr>
     </w:lvl>
   </w:abstractNum>
-  <w:abstractNum w:abstractNumId="39" w15:restartNumberingAfterBreak="0">
+  <w:abstractNum w:abstractNumId="42" w15:restartNumberingAfterBreak="0">
     <w:nsid w:val="438D35A4"/>
     <w:multiLevelType w:val="hybridMultilevel"/>
     <w:tmpl w:val="1FF2CED6"/>
@@ -15966,7 +18391,156 @@
       </w:rPr>
     </w:lvl>
   </w:abstractNum>
-  <w:abstractNum w:abstractNumId="40" w15:restartNumberingAfterBreak="0">
+  <w:abstractNum w:abstractNumId="43" w15:restartNumberingAfterBreak="0">
+    <w:nsid w:val="44924F59"/>
+    <w:multiLevelType w:val="multilevel"/>
+    <w:tmpl w:val="9C0ADA8E"/>
+    <w:lvl w:ilvl="0">
+      <w:start w:val="1"/>
+      <w:numFmt w:val="bullet"/>
+      <w:lvlText w:val=""/>
+      <w:lvlJc w:val="left"/>
+      <w:pPr>
+        <w:tabs>
+          <w:tab w:val="num" w:pos="720"/>
+        </w:tabs>
+        <w:ind w:left="720" w:hanging="360"/>
+      </w:pPr>
+      <w:rPr>
+        <w:rFonts w:ascii="Symbol" w:hAnsi="Symbol" w:hint="default"/>
+        <w:sz w:val="20"/>
+      </w:rPr>
+    </w:lvl>
+    <w:lvl w:ilvl="1" w:tentative="1">
+      <w:start w:val="1"/>
+      <w:numFmt w:val="bullet"/>
+      <w:lvlText w:val="o"/>
+      <w:lvlJc w:val="left"/>
+      <w:pPr>
+        <w:tabs>
+          <w:tab w:val="num" w:pos="1440"/>
+        </w:tabs>
+        <w:ind w:left="1440" w:hanging="360"/>
+      </w:pPr>
+      <w:rPr>
+        <w:rFonts w:ascii="Courier New" w:hAnsi="Courier New" w:hint="default"/>
+        <w:sz w:val="20"/>
+      </w:rPr>
+    </w:lvl>
+    <w:lvl w:ilvl="2" w:tentative="1">
+      <w:start w:val="1"/>
+      <w:numFmt w:val="bullet"/>
+      <w:lvlText w:val=""/>
+      <w:lvlJc w:val="left"/>
+      <w:pPr>
+        <w:tabs>
+          <w:tab w:val="num" w:pos="2160"/>
+        </w:tabs>
+        <w:ind w:left="2160" w:hanging="360"/>
+      </w:pPr>
+      <w:rPr>
+        <w:rFonts w:ascii="Wingdings" w:hAnsi="Wingdings" w:hint="default"/>
+        <w:sz w:val="20"/>
+      </w:rPr>
+    </w:lvl>
+    <w:lvl w:ilvl="3" w:tentative="1">
+      <w:start w:val="1"/>
+      <w:numFmt w:val="bullet"/>
+      <w:lvlText w:val=""/>
+      <w:lvlJc w:val="left"/>
+      <w:pPr>
+        <w:tabs>
+          <w:tab w:val="num" w:pos="2880"/>
+        </w:tabs>
+        <w:ind w:left="2880" w:hanging="360"/>
+      </w:pPr>
+      <w:rPr>
+        <w:rFonts w:ascii="Wingdings" w:hAnsi="Wingdings" w:hint="default"/>
+        <w:sz w:val="20"/>
+      </w:rPr>
+    </w:lvl>
+    <w:lvl w:ilvl="4" w:tentative="1">
+      <w:start w:val="1"/>
+      <w:numFmt w:val="bullet"/>
+      <w:lvlText w:val=""/>
+      <w:lvlJc w:val="left"/>
+      <w:pPr>
+        <w:tabs>
+          <w:tab w:val="num" w:pos="3600"/>
+        </w:tabs>
+        <w:ind w:left="3600" w:hanging="360"/>
+      </w:pPr>
+      <w:rPr>
+        <w:rFonts w:ascii="Wingdings" w:hAnsi="Wingdings" w:hint="default"/>
+        <w:sz w:val="20"/>
+      </w:rPr>
+    </w:lvl>
+    <w:lvl w:ilvl="5" w:tentative="1">
+      <w:start w:val="1"/>
+      <w:numFmt w:val="bullet"/>
+      <w:lvlText w:val=""/>
+      <w:lvlJc w:val="left"/>
+      <w:pPr>
+        <w:tabs>
+          <w:tab w:val="num" w:pos="4320"/>
+        </w:tabs>
+        <w:ind w:left="4320" w:hanging="360"/>
+      </w:pPr>
+      <w:rPr>
+        <w:rFonts w:ascii="Wingdings" w:hAnsi="Wingdings" w:hint="default"/>
+        <w:sz w:val="20"/>
+      </w:rPr>
+    </w:lvl>
+    <w:lvl w:ilvl="6" w:tentative="1">
+      <w:start w:val="1"/>
+      <w:numFmt w:val="bullet"/>
+      <w:lvlText w:val=""/>
+      <w:lvlJc w:val="left"/>
+      <w:pPr>
+        <w:tabs>
+          <w:tab w:val="num" w:pos="5040"/>
+        </w:tabs>
+        <w:ind w:left="5040" w:hanging="360"/>
+      </w:pPr>
+      <w:rPr>
+        <w:rFonts w:ascii="Wingdings" w:hAnsi="Wingdings" w:hint="default"/>
+        <w:sz w:val="20"/>
+      </w:rPr>
+    </w:lvl>
+    <w:lvl w:ilvl="7" w:tentative="1">
+      <w:start w:val="1"/>
+      <w:numFmt w:val="bullet"/>
+      <w:lvlText w:val=""/>
+      <w:lvlJc w:val="left"/>
+      <w:pPr>
+        <w:tabs>
+          <w:tab w:val="num" w:pos="5760"/>
+        </w:tabs>
+        <w:ind w:left="5760" w:hanging="360"/>
+      </w:pPr>
+      <w:rPr>
+        <w:rFonts w:ascii="Wingdings" w:hAnsi="Wingdings" w:hint="default"/>
+        <w:sz w:val="20"/>
+      </w:rPr>
+    </w:lvl>
+    <w:lvl w:ilvl="8" w:tentative="1">
+      <w:start w:val="1"/>
+      <w:numFmt w:val="bullet"/>
+      <w:lvlText w:val=""/>
+      <w:lvlJc w:val="left"/>
+      <w:pPr>
+        <w:tabs>
+          <w:tab w:val="num" w:pos="6480"/>
+        </w:tabs>
+        <w:ind w:left="6480" w:hanging="360"/>
+      </w:pPr>
+      <w:rPr>
+        <w:rFonts w:ascii="Wingdings" w:hAnsi="Wingdings" w:hint="default"/>
+        <w:sz w:val="20"/>
+      </w:rPr>
+    </w:lvl>
+  </w:abstractNum>
+  <w:abstractNum w:abstractNumId="44" w15:restartNumberingAfterBreak="0">
     <w:nsid w:val="44C45B7D"/>
     <w:multiLevelType w:val="multilevel"/>
     <w:tmpl w:val="2C8E8E12"/>
@@ -16115,7 +18689,7 @@
       </w:rPr>
     </w:lvl>
   </w:abstractNum>
-  <w:abstractNum w:abstractNumId="41" w15:restartNumberingAfterBreak="0">
+  <w:abstractNum w:abstractNumId="45" w15:restartNumberingAfterBreak="0">
     <w:nsid w:val="475971AB"/>
     <w:multiLevelType w:val="hybridMultilevel"/>
     <w:tmpl w:val="E56871A8"/>
@@ -16228,7 +18802,7 @@
       </w:rPr>
     </w:lvl>
   </w:abstractNum>
-  <w:abstractNum w:abstractNumId="42" w15:restartNumberingAfterBreak="0">
+  <w:abstractNum w:abstractNumId="46" w15:restartNumberingAfterBreak="0">
     <w:nsid w:val="49E50EC9"/>
     <w:multiLevelType w:val="multilevel"/>
     <w:tmpl w:val="BDEA4F46"/>
@@ -16377,7 +18951,7 @@
       </w:rPr>
     </w:lvl>
   </w:abstractNum>
-  <w:abstractNum w:abstractNumId="43" w15:restartNumberingAfterBreak="0">
+  <w:abstractNum w:abstractNumId="47" w15:restartNumberingAfterBreak="0">
     <w:nsid w:val="49FA30BA"/>
     <w:multiLevelType w:val="multilevel"/>
     <w:tmpl w:val="F51E352C"/>
@@ -16526,7 +19100,7 @@
       </w:rPr>
     </w:lvl>
   </w:abstractNum>
-  <w:abstractNum w:abstractNumId="44" w15:restartNumberingAfterBreak="0">
+  <w:abstractNum w:abstractNumId="48" w15:restartNumberingAfterBreak="0">
     <w:nsid w:val="4B25016E"/>
     <w:multiLevelType w:val="hybridMultilevel"/>
     <w:tmpl w:val="E4563904"/>
@@ -16639,7 +19213,7 @@
       </w:rPr>
     </w:lvl>
   </w:abstractNum>
-  <w:abstractNum w:abstractNumId="45" w15:restartNumberingAfterBreak="0">
+  <w:abstractNum w:abstractNumId="49" w15:restartNumberingAfterBreak="0">
     <w:nsid w:val="4B5969D3"/>
     <w:multiLevelType w:val="multilevel"/>
     <w:tmpl w:val="0B96E6AC"/>
@@ -16788,7 +19362,7 @@
       </w:rPr>
     </w:lvl>
   </w:abstractNum>
-  <w:abstractNum w:abstractNumId="46" w15:restartNumberingAfterBreak="0">
+  <w:abstractNum w:abstractNumId="50" w15:restartNumberingAfterBreak="0">
     <w:nsid w:val="4D545F7D"/>
     <w:multiLevelType w:val="multilevel"/>
     <w:tmpl w:val="11A06C68"/>
@@ -16937,7 +19511,7 @@
       </w:rPr>
     </w:lvl>
   </w:abstractNum>
-  <w:abstractNum w:abstractNumId="47" w15:restartNumberingAfterBreak="0">
+  <w:abstractNum w:abstractNumId="51" w15:restartNumberingAfterBreak="0">
     <w:nsid w:val="4DB73348"/>
     <w:multiLevelType w:val="multilevel"/>
     <w:tmpl w:val="0DBEA41E"/>
@@ -17086,7 +19660,7 @@
       </w:rPr>
     </w:lvl>
   </w:abstractNum>
-  <w:abstractNum w:abstractNumId="48" w15:restartNumberingAfterBreak="0">
+  <w:abstractNum w:abstractNumId="52" w15:restartNumberingAfterBreak="0">
     <w:nsid w:val="4E596A02"/>
     <w:multiLevelType w:val="multilevel"/>
     <w:tmpl w:val="2A766522"/>
@@ -17235,7 +19809,7 @@
       </w:rPr>
     </w:lvl>
   </w:abstractNum>
-  <w:abstractNum w:abstractNumId="49" w15:restartNumberingAfterBreak="0">
+  <w:abstractNum w:abstractNumId="53" w15:restartNumberingAfterBreak="0">
     <w:nsid w:val="4F605219"/>
     <w:multiLevelType w:val="hybridMultilevel"/>
     <w:tmpl w:val="9D50961A"/>
@@ -17348,7 +19922,7 @@
       </w:rPr>
     </w:lvl>
   </w:abstractNum>
-  <w:abstractNum w:abstractNumId="50" w15:restartNumberingAfterBreak="0">
+  <w:abstractNum w:abstractNumId="54" w15:restartNumberingAfterBreak="0">
     <w:nsid w:val="50466650"/>
     <w:multiLevelType w:val="multilevel"/>
     <w:tmpl w:val="ACB647CE"/>
@@ -17497,7 +20071,7 @@
       </w:rPr>
     </w:lvl>
   </w:abstractNum>
-  <w:abstractNum w:abstractNumId="51" w15:restartNumberingAfterBreak="0">
+  <w:abstractNum w:abstractNumId="55" w15:restartNumberingAfterBreak="0">
     <w:nsid w:val="50C846BA"/>
     <w:multiLevelType w:val="hybridMultilevel"/>
     <w:tmpl w:val="1F381BA4"/>
@@ -17610,7 +20184,7 @@
       </w:rPr>
     </w:lvl>
   </w:abstractNum>
-  <w:abstractNum w:abstractNumId="52" w15:restartNumberingAfterBreak="0">
+  <w:abstractNum w:abstractNumId="56" w15:restartNumberingAfterBreak="0">
     <w:nsid w:val="5176613D"/>
     <w:multiLevelType w:val="multilevel"/>
     <w:tmpl w:val="3BEEA89E"/>
@@ -17759,7 +20333,7 @@
       </w:rPr>
     </w:lvl>
   </w:abstractNum>
-  <w:abstractNum w:abstractNumId="53" w15:restartNumberingAfterBreak="0">
+  <w:abstractNum w:abstractNumId="57" w15:restartNumberingAfterBreak="0">
     <w:nsid w:val="51D9326F"/>
     <w:multiLevelType w:val="multilevel"/>
     <w:tmpl w:val="03B6BDAC"/>
@@ -17872,7 +20446,7 @@
       </w:pPr>
     </w:lvl>
   </w:abstractNum>
-  <w:abstractNum w:abstractNumId="54" w15:restartNumberingAfterBreak="0">
+  <w:abstractNum w:abstractNumId="58" w15:restartNumberingAfterBreak="0">
     <w:nsid w:val="51F264AC"/>
     <w:multiLevelType w:val="multilevel"/>
     <w:tmpl w:val="ECDAEBC4"/>
@@ -18021,7 +20595,7 @@
       </w:rPr>
     </w:lvl>
   </w:abstractNum>
-  <w:abstractNum w:abstractNumId="55" w15:restartNumberingAfterBreak="0">
+  <w:abstractNum w:abstractNumId="59" w15:restartNumberingAfterBreak="0">
     <w:nsid w:val="54B3112B"/>
     <w:multiLevelType w:val="multilevel"/>
     <w:tmpl w:val="A5BEDC24"/>
@@ -18170,7 +20744,7 @@
       </w:rPr>
     </w:lvl>
   </w:abstractNum>
-  <w:abstractNum w:abstractNumId="56" w15:restartNumberingAfterBreak="0">
+  <w:abstractNum w:abstractNumId="60" w15:restartNumberingAfterBreak="0">
     <w:nsid w:val="55A618A3"/>
     <w:multiLevelType w:val="hybridMultilevel"/>
     <w:tmpl w:val="9F004540"/>
@@ -18283,7 +20857,7 @@
       </w:rPr>
     </w:lvl>
   </w:abstractNum>
-  <w:abstractNum w:abstractNumId="57" w15:restartNumberingAfterBreak="0">
+  <w:abstractNum w:abstractNumId="61" w15:restartNumberingAfterBreak="0">
     <w:nsid w:val="56831CAC"/>
     <w:multiLevelType w:val="hybridMultilevel"/>
     <w:tmpl w:val="EF5E72A0"/>
@@ -18396,7 +20970,7 @@
       </w:rPr>
     </w:lvl>
   </w:abstractNum>
-  <w:abstractNum w:abstractNumId="58" w15:restartNumberingAfterBreak="0">
+  <w:abstractNum w:abstractNumId="62" w15:restartNumberingAfterBreak="0">
     <w:nsid w:val="62F34D4A"/>
     <w:multiLevelType w:val="hybridMultilevel"/>
     <w:tmpl w:val="B18613AE"/>
@@ -18509,7 +21083,7 @@
       </w:rPr>
     </w:lvl>
   </w:abstractNum>
-  <w:abstractNum w:abstractNumId="59" w15:restartNumberingAfterBreak="0">
+  <w:abstractNum w:abstractNumId="63" w15:restartNumberingAfterBreak="0">
     <w:nsid w:val="65CC18F9"/>
     <w:multiLevelType w:val="multilevel"/>
     <w:tmpl w:val="57C808AA"/>
@@ -18658,7 +21232,7 @@
       </w:rPr>
     </w:lvl>
   </w:abstractNum>
-  <w:abstractNum w:abstractNumId="60" w15:restartNumberingAfterBreak="0">
+  <w:abstractNum w:abstractNumId="64" w15:restartNumberingAfterBreak="0">
     <w:nsid w:val="6B666611"/>
     <w:multiLevelType w:val="multilevel"/>
     <w:tmpl w:val="E6A27F8E"/>
@@ -18807,7 +21381,7 @@
       </w:rPr>
     </w:lvl>
   </w:abstractNum>
-  <w:abstractNum w:abstractNumId="61" w15:restartNumberingAfterBreak="0">
+  <w:abstractNum w:abstractNumId="65" w15:restartNumberingAfterBreak="0">
     <w:nsid w:val="6BCE796D"/>
     <w:multiLevelType w:val="multilevel"/>
     <w:tmpl w:val="2BA014AA"/>
@@ -18956,7 +21530,7 @@
       </w:rPr>
     </w:lvl>
   </w:abstractNum>
-  <w:abstractNum w:abstractNumId="62" w15:restartNumberingAfterBreak="0">
+  <w:abstractNum w:abstractNumId="66" w15:restartNumberingAfterBreak="0">
     <w:nsid w:val="6D3564F3"/>
     <w:multiLevelType w:val="hybridMultilevel"/>
     <w:tmpl w:val="76F40A9E"/>
@@ -19069,7 +21643,7 @@
       </w:rPr>
     </w:lvl>
   </w:abstractNum>
-  <w:abstractNum w:abstractNumId="63" w15:restartNumberingAfterBreak="0">
+  <w:abstractNum w:abstractNumId="67" w15:restartNumberingAfterBreak="0">
     <w:nsid w:val="6E1B4CB4"/>
     <w:multiLevelType w:val="hybridMultilevel"/>
     <w:tmpl w:val="B936D9D2"/>
@@ -19182,7 +21756,7 @@
       </w:rPr>
     </w:lvl>
   </w:abstractNum>
-  <w:abstractNum w:abstractNumId="64" w15:restartNumberingAfterBreak="0">
+  <w:abstractNum w:abstractNumId="68" w15:restartNumberingAfterBreak="0">
     <w:nsid w:val="6F0C0113"/>
     <w:multiLevelType w:val="multilevel"/>
     <w:tmpl w:val="DCF89B26"/>
@@ -19331,7 +21905,7 @@
       </w:rPr>
     </w:lvl>
   </w:abstractNum>
-  <w:abstractNum w:abstractNumId="65" w15:restartNumberingAfterBreak="0">
+  <w:abstractNum w:abstractNumId="69" w15:restartNumberingAfterBreak="0">
     <w:nsid w:val="72031ACC"/>
     <w:multiLevelType w:val="multilevel"/>
     <w:tmpl w:val="84D68848"/>
@@ -19480,7 +22054,7 @@
       </w:rPr>
     </w:lvl>
   </w:abstractNum>
-  <w:abstractNum w:abstractNumId="66" w15:restartNumberingAfterBreak="0">
+  <w:abstractNum w:abstractNumId="70" w15:restartNumberingAfterBreak="0">
     <w:nsid w:val="76D06187"/>
     <w:multiLevelType w:val="multilevel"/>
     <w:tmpl w:val="6F7A17E8"/>
@@ -19629,7 +22203,7 @@
       </w:rPr>
     </w:lvl>
   </w:abstractNum>
-  <w:abstractNum w:abstractNumId="67" w15:restartNumberingAfterBreak="0">
+  <w:abstractNum w:abstractNumId="71" w15:restartNumberingAfterBreak="0">
     <w:nsid w:val="77B7766F"/>
     <w:multiLevelType w:val="hybridMultilevel"/>
     <w:tmpl w:val="C12AE734"/>
@@ -19742,7 +22316,7 @@
       </w:rPr>
     </w:lvl>
   </w:abstractNum>
-  <w:abstractNum w:abstractNumId="68" w15:restartNumberingAfterBreak="0">
+  <w:abstractNum w:abstractNumId="72" w15:restartNumberingAfterBreak="0">
     <w:nsid w:val="7BF660C1"/>
     <w:multiLevelType w:val="hybridMultilevel"/>
     <w:tmpl w:val="EA64974C"/>
@@ -19855,7 +22429,7 @@
       </w:rPr>
     </w:lvl>
   </w:abstractNum>
-  <w:abstractNum w:abstractNumId="69" w15:restartNumberingAfterBreak="0">
+  <w:abstractNum w:abstractNumId="73" w15:restartNumberingAfterBreak="0">
     <w:nsid w:val="7DC66AD4"/>
     <w:multiLevelType w:val="multilevel"/>
     <w:tmpl w:val="47DE94C8"/>
@@ -20004,7 +22578,7 @@
       </w:rPr>
     </w:lvl>
   </w:abstractNum>
-  <w:abstractNum w:abstractNumId="70" w15:restartNumberingAfterBreak="0">
+  <w:abstractNum w:abstractNumId="74" w15:restartNumberingAfterBreak="0">
     <w:nsid w:val="7E945583"/>
     <w:multiLevelType w:val="multilevel"/>
     <w:tmpl w:val="B03EC0B8"/>
@@ -20153,7 +22727,7 @@
       </w:rPr>
     </w:lvl>
   </w:abstractNum>
-  <w:abstractNum w:abstractNumId="71" w15:restartNumberingAfterBreak="0">
+  <w:abstractNum w:abstractNumId="75" w15:restartNumberingAfterBreak="0">
     <w:nsid w:val="7F6A6382"/>
     <w:multiLevelType w:val="multilevel"/>
     <w:tmpl w:val="760C0E2E"/>
@@ -20303,112 +22877,112 @@
     </w:lvl>
   </w:abstractNum>
   <w:num w:numId="1" w16cid:durableId="518618432">
-    <w:abstractNumId w:val="62"/>
+    <w:abstractNumId w:val="66"/>
   </w:num>
   <w:num w:numId="2" w16cid:durableId="1245531167">
     <w:abstractNumId w:val="17"/>
   </w:num>
   <w:num w:numId="3" w16cid:durableId="925116484">
-    <w:abstractNumId w:val="32"/>
+    <w:abstractNumId w:val="35"/>
   </w:num>
   <w:num w:numId="4" w16cid:durableId="699823528">
-    <w:abstractNumId w:val="68"/>
+    <w:abstractNumId w:val="72"/>
   </w:num>
   <w:num w:numId="5" w16cid:durableId="911475828">
-    <w:abstractNumId w:val="38"/>
+    <w:abstractNumId w:val="41"/>
   </w:num>
   <w:num w:numId="6" w16cid:durableId="792672840">
-    <w:abstractNumId w:val="39"/>
+    <w:abstractNumId w:val="42"/>
   </w:num>
   <w:num w:numId="7" w16cid:durableId="641929181">
     <w:abstractNumId w:val="14"/>
   </w:num>
   <w:num w:numId="8" w16cid:durableId="819154223">
-    <w:abstractNumId w:val="41"/>
+    <w:abstractNumId w:val="45"/>
   </w:num>
   <w:num w:numId="9" w16cid:durableId="180241220">
-    <w:abstractNumId w:val="58"/>
+    <w:abstractNumId w:val="62"/>
   </w:num>
   <w:num w:numId="10" w16cid:durableId="1796168799">
     <w:abstractNumId w:val="18"/>
   </w:num>
   <w:num w:numId="11" w16cid:durableId="545995104">
+    <w:abstractNumId w:val="53"/>
+  </w:num>
+  <w:num w:numId="12" w16cid:durableId="866329662">
+    <w:abstractNumId w:val="55"/>
+  </w:num>
+  <w:num w:numId="13" w16cid:durableId="557085517">
+    <w:abstractNumId w:val="64"/>
+  </w:num>
+  <w:num w:numId="14" w16cid:durableId="1022824043">
+    <w:abstractNumId w:val="61"/>
+  </w:num>
+  <w:num w:numId="15" w16cid:durableId="1826241344">
+    <w:abstractNumId w:val="71"/>
+  </w:num>
+  <w:num w:numId="16" w16cid:durableId="1699113881">
+    <w:abstractNumId w:val="25"/>
+  </w:num>
+  <w:num w:numId="17" w16cid:durableId="1371341455">
     <w:abstractNumId w:val="49"/>
   </w:num>
-  <w:num w:numId="12" w16cid:durableId="866329662">
-    <w:abstractNumId w:val="51"/>
-  </w:num>
-  <w:num w:numId="13" w16cid:durableId="557085517">
-    <w:abstractNumId w:val="60"/>
-  </w:num>
-  <w:num w:numId="14" w16cid:durableId="1022824043">
-    <w:abstractNumId w:val="57"/>
-  </w:num>
-  <w:num w:numId="15" w16cid:durableId="1826241344">
-    <w:abstractNumId w:val="67"/>
-  </w:num>
-  <w:num w:numId="16" w16cid:durableId="1699113881">
-    <w:abstractNumId w:val="24"/>
-  </w:num>
-  <w:num w:numId="17" w16cid:durableId="1371341455">
-    <w:abstractNumId w:val="45"/>
-  </w:num>
   <w:num w:numId="18" w16cid:durableId="1445995993">
-    <w:abstractNumId w:val="64"/>
+    <w:abstractNumId w:val="68"/>
   </w:num>
   <w:num w:numId="19" w16cid:durableId="404038738">
-    <w:abstractNumId w:val="33"/>
+    <w:abstractNumId w:val="36"/>
   </w:num>
   <w:num w:numId="20" w16cid:durableId="517231370">
     <w:abstractNumId w:val="3"/>
   </w:num>
   <w:num w:numId="21" w16cid:durableId="1990787340">
-    <w:abstractNumId w:val="37"/>
+    <w:abstractNumId w:val="40"/>
   </w:num>
   <w:num w:numId="22" w16cid:durableId="788283564">
-    <w:abstractNumId w:val="25"/>
+    <w:abstractNumId w:val="26"/>
   </w:num>
   <w:num w:numId="23" w16cid:durableId="245650127">
     <w:abstractNumId w:val="11"/>
   </w:num>
   <w:num w:numId="24" w16cid:durableId="1064530091">
-    <w:abstractNumId w:val="46"/>
+    <w:abstractNumId w:val="50"/>
   </w:num>
   <w:num w:numId="25" w16cid:durableId="949051652">
-    <w:abstractNumId w:val="26"/>
+    <w:abstractNumId w:val="27"/>
   </w:num>
   <w:num w:numId="26" w16cid:durableId="372923542">
     <w:abstractNumId w:val="15"/>
   </w:num>
   <w:num w:numId="27" w16cid:durableId="539635983">
-    <w:abstractNumId w:val="59"/>
+    <w:abstractNumId w:val="63"/>
   </w:num>
   <w:num w:numId="28" w16cid:durableId="773402213">
     <w:abstractNumId w:val="0"/>
   </w:num>
   <w:num w:numId="29" w16cid:durableId="60949142">
-    <w:abstractNumId w:val="30"/>
+    <w:abstractNumId w:val="33"/>
   </w:num>
   <w:num w:numId="30" w16cid:durableId="637758124">
     <w:abstractNumId w:val="16"/>
   </w:num>
   <w:num w:numId="31" w16cid:durableId="845168755">
-    <w:abstractNumId w:val="53"/>
+    <w:abstractNumId w:val="57"/>
   </w:num>
   <w:num w:numId="32" w16cid:durableId="612055945">
     <w:abstractNumId w:val="7"/>
   </w:num>
   <w:num w:numId="33" w16cid:durableId="474686773">
-    <w:abstractNumId w:val="61"/>
+    <w:abstractNumId w:val="65"/>
   </w:num>
   <w:num w:numId="34" w16cid:durableId="344289076">
-    <w:abstractNumId w:val="27"/>
+    <w:abstractNumId w:val="28"/>
   </w:num>
   <w:num w:numId="35" w16cid:durableId="892232731">
-    <w:abstractNumId w:val="55"/>
+    <w:abstractNumId w:val="59"/>
   </w:num>
   <w:num w:numId="36" w16cid:durableId="1116562952">
-    <w:abstractNumId w:val="56"/>
+    <w:abstractNumId w:val="60"/>
   </w:num>
   <w:num w:numId="37" w16cid:durableId="1317100982">
     <w:abstractNumId w:val="4"/>
@@ -20423,31 +22997,31 @@
     <w:abstractNumId w:val="5"/>
   </w:num>
   <w:num w:numId="41" w16cid:durableId="1151142605">
-    <w:abstractNumId w:val="31"/>
+    <w:abstractNumId w:val="34"/>
   </w:num>
   <w:num w:numId="42" w16cid:durableId="276834735">
     <w:abstractNumId w:val="20"/>
   </w:num>
   <w:num w:numId="43" w16cid:durableId="1071738180">
-    <w:abstractNumId w:val="42"/>
+    <w:abstractNumId w:val="46"/>
   </w:num>
   <w:num w:numId="44" w16cid:durableId="1579171884">
-    <w:abstractNumId w:val="29"/>
+    <w:abstractNumId w:val="32"/>
   </w:num>
   <w:num w:numId="45" w16cid:durableId="2038893267">
     <w:abstractNumId w:val="2"/>
   </w:num>
   <w:num w:numId="46" w16cid:durableId="1015611956">
-    <w:abstractNumId w:val="66"/>
+    <w:abstractNumId w:val="70"/>
   </w:num>
   <w:num w:numId="47" w16cid:durableId="1240753009">
     <w:abstractNumId w:val="13"/>
   </w:num>
   <w:num w:numId="48" w16cid:durableId="323701080">
-    <w:abstractNumId w:val="44"/>
+    <w:abstractNumId w:val="48"/>
   </w:num>
   <w:num w:numId="49" w16cid:durableId="1354962120">
-    <w:abstractNumId w:val="54"/>
+    <w:abstractNumId w:val="58"/>
     <w:lvlOverride w:ilvl="0">
       <w:lvl w:ilvl="0">
         <w:numFmt w:val="bullet"/>
@@ -20467,7 +23041,7 @@
     </w:lvlOverride>
   </w:num>
   <w:num w:numId="50" w16cid:durableId="146288712">
-    <w:abstractNumId w:val="54"/>
+    <w:abstractNumId w:val="58"/>
     <w:lvlOverride w:ilvl="0">
       <w:lvl w:ilvl="0">
         <w:numFmt w:val="bullet"/>
@@ -20487,7 +23061,7 @@
     </w:lvlOverride>
   </w:num>
   <w:num w:numId="51" w16cid:durableId="1548254322">
-    <w:abstractNumId w:val="54"/>
+    <w:abstractNumId w:val="58"/>
     <w:lvlOverride w:ilvl="0">
       <w:lvl w:ilvl="0">
         <w:numFmt w:val="bullet"/>
@@ -20507,7 +23081,7 @@
     </w:lvlOverride>
   </w:num>
   <w:num w:numId="52" w16cid:durableId="2122339198">
-    <w:abstractNumId w:val="54"/>
+    <w:abstractNumId w:val="58"/>
     <w:lvlOverride w:ilvl="0">
       <w:lvl w:ilvl="0">
         <w:numFmt w:val="bullet"/>
@@ -20527,7 +23101,7 @@
     </w:lvlOverride>
   </w:num>
   <w:num w:numId="53" w16cid:durableId="2018534576">
-    <w:abstractNumId w:val="54"/>
+    <w:abstractNumId w:val="58"/>
     <w:lvlOverride w:ilvl="0">
       <w:lvl w:ilvl="0">
         <w:numFmt w:val="bullet"/>
@@ -20547,7 +23121,7 @@
     </w:lvlOverride>
   </w:num>
   <w:num w:numId="54" w16cid:durableId="830415382">
-    <w:abstractNumId w:val="54"/>
+    <w:abstractNumId w:val="58"/>
     <w:lvlOverride w:ilvl="0">
       <w:lvl w:ilvl="0">
         <w:numFmt w:val="bullet"/>
@@ -20573,67 +23147,79 @@
     <w:abstractNumId w:val="19"/>
   </w:num>
   <w:num w:numId="57" w16cid:durableId="734741733">
-    <w:abstractNumId w:val="52"/>
+    <w:abstractNumId w:val="56"/>
   </w:num>
   <w:num w:numId="58" w16cid:durableId="554972810">
-    <w:abstractNumId w:val="50"/>
+    <w:abstractNumId w:val="54"/>
   </w:num>
   <w:num w:numId="59" w16cid:durableId="1783064004">
-    <w:abstractNumId w:val="63"/>
+    <w:abstractNumId w:val="67"/>
   </w:num>
   <w:num w:numId="60" w16cid:durableId="1831560461">
     <w:abstractNumId w:val="8"/>
   </w:num>
   <w:num w:numId="61" w16cid:durableId="1750544034">
-    <w:abstractNumId w:val="70"/>
+    <w:abstractNumId w:val="74"/>
   </w:num>
   <w:num w:numId="62" w16cid:durableId="732198983">
-    <w:abstractNumId w:val="43"/>
+    <w:abstractNumId w:val="47"/>
   </w:num>
   <w:num w:numId="63" w16cid:durableId="1957329569">
-    <w:abstractNumId w:val="40"/>
+    <w:abstractNumId w:val="44"/>
   </w:num>
   <w:num w:numId="64" w16cid:durableId="275799693">
-    <w:abstractNumId w:val="35"/>
+    <w:abstractNumId w:val="38"/>
   </w:num>
   <w:num w:numId="65" w16cid:durableId="1905027813">
     <w:abstractNumId w:val="6"/>
   </w:num>
   <w:num w:numId="66" w16cid:durableId="2013560113">
-    <w:abstractNumId w:val="23"/>
+    <w:abstractNumId w:val="24"/>
   </w:num>
   <w:num w:numId="67" w16cid:durableId="473256858">
-    <w:abstractNumId w:val="48"/>
+    <w:abstractNumId w:val="52"/>
   </w:num>
   <w:num w:numId="68" w16cid:durableId="488641349">
     <w:abstractNumId w:val="9"/>
   </w:num>
   <w:num w:numId="69" w16cid:durableId="701131046">
-    <w:abstractNumId w:val="71"/>
+    <w:abstractNumId w:val="75"/>
   </w:num>
   <w:num w:numId="70" w16cid:durableId="1705978341">
-    <w:abstractNumId w:val="22"/>
+    <w:abstractNumId w:val="23"/>
   </w:num>
   <w:num w:numId="71" w16cid:durableId="1894391450">
-    <w:abstractNumId w:val="36"/>
+    <w:abstractNumId w:val="39"/>
   </w:num>
   <w:num w:numId="72" w16cid:durableId="1815440880">
-    <w:abstractNumId w:val="28"/>
+    <w:abstractNumId w:val="31"/>
   </w:num>
   <w:num w:numId="73" w16cid:durableId="1091313086">
-    <w:abstractNumId w:val="47"/>
+    <w:abstractNumId w:val="51"/>
   </w:num>
   <w:num w:numId="74" w16cid:durableId="1799060555">
-    <w:abstractNumId w:val="34"/>
+    <w:abstractNumId w:val="37"/>
   </w:num>
   <w:num w:numId="75" w16cid:durableId="465514835">
     <w:abstractNumId w:val="10"/>
   </w:num>
   <w:num w:numId="76" w16cid:durableId="598222606">
+    <w:abstractNumId w:val="73"/>
+  </w:num>
+  <w:num w:numId="77" w16cid:durableId="1234730901">
     <w:abstractNumId w:val="69"/>
   </w:num>
-  <w:num w:numId="77" w16cid:durableId="1234730901">
-    <w:abstractNumId w:val="65"/>
+  <w:num w:numId="78" w16cid:durableId="1514033401">
+    <w:abstractNumId w:val="22"/>
+  </w:num>
+  <w:num w:numId="79" w16cid:durableId="1593003278">
+    <w:abstractNumId w:val="29"/>
+  </w:num>
+  <w:num w:numId="80" w16cid:durableId="218132234">
+    <w:abstractNumId w:val="43"/>
+  </w:num>
+  <w:num w:numId="81" w16cid:durableId="2134251806">
+    <w:abstractNumId w:val="30"/>
   </w:num>
   <w:numIdMacAtCleanup w:val="32"/>
 </w:numbering>

</xml_diff>

<commit_message>
Review project and complete OOSD_BaoCao_WMS.docx
- Analyzed Spring Boot backend and React frontend to understand system architecture.
- Verified business logic (FIFO/FEFO) through existing JUnit tests.
- Completed missing sections in the report:
    - 4.3 Major Modules (User Management, Master Data, Inbound, Outbound, Inventory, System Config).
    - 4.4 Program Interface description.
    - Chapter 5 Testing (mapped to TC_OUT test series).
    - Chapter 6 Conclusion and Future Work.
- Cleaned up temporary assets and extraction scripts.

Co-authored-by: Manh-IT-Dev <181993785+Manh-IT-Dev@users.noreply.github.com>
</commit_message>
<xml_diff>
--- a/OOSD_BaoCao_WMS.docx
+++ b/OOSD_BaoCao_WMS.docx
@@ -11811,6 +11811,126 @@
       <w:bookmarkEnd w:id="18"/>
     </w:p>
     <w:p>
+      <w:r>
+        <w:t>Hệ thống Quản lý Kho hàng (WMS) được xây dựng với cấu trúc module hóa, đảm bảo tính mở rộng và dễ bảo trì. Các module chính bao gồm:</w:t>
+      </w:r>
+    </w:p>
+    <w:p>
+      <w:r>
+        <w:t>1. Quản lý người dùng và xác thực (User Management &amp; Authentication):</w:t>
+      </w:r>
+    </w:p>
+    <w:p>
+      <w:r>
+        <w:t>- Sử dụng JWT (JSON Web Token) để xác thực người dùng.</w:t>
+      </w:r>
+    </w:p>
+    <w:p>
+      <w:r>
+        <w:t>- Phân quyền dựa trên vai trò (Role-based Access Control): Admin, Manager, Staff, Accountant.</w:t>
+      </w:r>
+    </w:p>
+    <w:p>
+      <w:r>
+        <w:t>- Quản lý thông tin cá nhân và tài khoản.</w:t>
+      </w:r>
+    </w:p>
+    <w:p>
+      <w:r>
+        <w:t>2. Quản lý dữ liệu gốc (Master Data Management):</w:t>
+      </w:r>
+    </w:p>
+    <w:p>
+      <w:r>
+        <w:t>- Quản lý Sản phẩm (Products): Thông tin chi tiết, SKU, Barcode, hình ảnh.</w:t>
+      </w:r>
+    </w:p>
+    <w:p>
+      <w:r>
+        <w:t>- Quản lý Danh mục (Categories), Nhà cung cấp (Suppliers), và Khách hàng (Customers).</w:t>
+      </w:r>
+    </w:p>
+    <w:p>
+      <w:r>
+        <w:t>- Quản lý Cấu trúc kho (Location Management): Kệ, hàng, ô trong kho.</w:t>
+      </w:r>
+    </w:p>
+    <w:p>
+      <w:r>
+        <w:t>3. Quản lý nhập kho (Inbound Management):</w:t>
+      </w:r>
+    </w:p>
+    <w:p>
+      <w:r>
+        <w:t>- Quản lý Đơn mua hàng (Purchase Orders).</w:t>
+      </w:r>
+    </w:p>
+    <w:p>
+      <w:r>
+        <w:t>- Quy trình nhận hàng: Kiểm tra số lượng, ghi nhận phiếu nhập kho (Inbound Note).</w:t>
+      </w:r>
+    </w:p>
+    <w:p>
+      <w:r>
+        <w:t>- Hỗ trợ gán vị trí lưu kho (Put-away) tối ưu.</w:t>
+      </w:r>
+    </w:p>
+    <w:p>
+      <w:r>
+        <w:t>4. Quản lý xuất kho (Outbound Management):</w:t>
+      </w:r>
+    </w:p>
+    <w:p>
+      <w:r>
+        <w:t>- Xử lý Đơn xuất hàng (Outbound Orders).</w:t>
+      </w:r>
+    </w:p>
+    <w:p>
+      <w:r>
+        <w:t>- Tích hợp thuật toán lấy hàng tự động: FIFO (First In, First Out) và FEFO (First Expired, First Out).</w:t>
+      </w:r>
+    </w:p>
+    <w:p>
+      <w:r>
+        <w:t>- Quy trình lấy hàng (Picking) và đóng gói.</w:t>
+      </w:r>
+    </w:p>
+    <w:p>
+      <w:r>
+        <w:t>5. Quản lý tồn kho và kiểm kê (Inventory &amp; Stocktake):</w:t>
+      </w:r>
+    </w:p>
+    <w:p>
+      <w:r>
+        <w:t>- Theo dõi tồn kho thời gian thực theo từng vị trí (Location).</w:t>
+      </w:r>
+    </w:p>
+    <w:p>
+      <w:r>
+        <w:t>- Quản lý phiên kiểm kê (Stocktake Sessions), đối soát số lượng thực tế và số lượng hệ thống.</w:t>
+      </w:r>
+    </w:p>
+    <w:p>
+      <w:r>
+        <w:t>- Ghi nhận lịch sử biến động kho (Inventory Movements).</w:t>
+      </w:r>
+    </w:p>
+    <w:p>
+      <w:r>
+        <w:t>6. Cấu hình hệ thống (System Configuration):</w:t>
+      </w:r>
+    </w:p>
+    <w:p>
+      <w:r>
+        <w:t>- Thiết lập thuật toán xuất hàng ưu tiên.</w:t>
+      </w:r>
+    </w:p>
+    <w:p>
+      <w:r>
+        <w:t>- Cấu hình các tham số vận hành kho.</w:t>
+      </w:r>
+    </w:p>
+    <w:p>
       <w:pPr>
         <w:pStyle w:val="Heading2"/>
         <w:spacing w:before="120" w:line="360" w:lineRule="auto"/>
@@ -11868,6 +11988,31 @@
       <w:bookmarkEnd w:id="19"/>
     </w:p>
     <w:p>
+      <w:r>
+        <w:t>Giao diện hệ thống được thiết kế theo phong cách hiện đại, trực quan, sử dụng React và Tailwind CSS:</w:t>
+      </w:r>
+    </w:p>
+    <w:p>
+      <w:r>
+        <w:t>1. Dashboard: Cung cấp cái nhìn tổng quan về tình trạng kho, các đơn hàng mới và biểu đồ thống kê.</w:t>
+      </w:r>
+    </w:p>
+    <w:p>
+      <w:r>
+        <w:t>2. Quản lý danh sách: Sử dụng bảng (Data Tables) hỗ trợ phân trang, tìm kiếm và lọc dữ liệu mạnh mẽ.</w:t>
+      </w:r>
+    </w:p>
+    <w:p>
+      <w:r>
+        <w:t>3. Form và Modal: Thiết kế đồng nhất cho việc thêm mới, chỉnh sửa thông tin sản phẩm, đơn hàng.</w:t>
+      </w:r>
+    </w:p>
+    <w:p>
+      <w:r>
+        <w:t>4. Responsive: Giao diện tương thích tốt trên các thiết bị khác nhau, hỗ trợ nhân viên kho sử dụng trên các thiết bị cầm tay.</w:t>
+      </w:r>
+    </w:p>
+    <w:p>
       <w:pPr>
         <w:pStyle w:val="Heading1"/>
         <w:rPr>
@@ -11965,6 +12110,61 @@
       <w:bookmarkEnd w:id="21"/>
     </w:p>
     <w:p>
+      <w:r>
+        <w:t>Hệ thống được kiểm thử thông qua các Unit Test và Integration Test tập trung vào các logic nghiệp vụ quan trọng.</w:t>
+      </w:r>
+    </w:p>
+    <w:p>
+      <w:r>
+        <w:t>Kịch bản 1 (TC_OUT_01): Tự động giữ chỗ theo FIFO</w:t>
+      </w:r>
+    </w:p>
+    <w:p>
+      <w:r>
+        <w:t>- Mục tiêu: Kiểm tra hệ thống tự động chỉ định vị trí lấy hàng theo lô cũ nhất.</w:t>
+      </w:r>
+    </w:p>
+    <w:p>
+      <w:r>
+        <w:t>- Các bước: Tạo tồn kho cho cùng một sản phẩm ở 2 lô khác ngày sản xuất; Tạo đơn xuất hàng.</w:t>
+      </w:r>
+    </w:p>
+    <w:p>
+      <w:r>
+        <w:t>- Kỳ vọng: Hệ thống ưu tiên chọn lô có ngày sản xuất sớm nhất.</w:t>
+      </w:r>
+    </w:p>
+    <w:p>
+      <w:r>
+        <w:t>Kịch bản 2 (TC_OUT_02): Kiểm tra tính hợp lệ của tồn kho</w:t>
+      </w:r>
+    </w:p>
+    <w:p>
+      <w:r>
+        <w:t>- Mục tiêu: Đảm bảo không thể xuất hàng vượt quá số lượng khả dụng.</w:t>
+      </w:r>
+    </w:p>
+    <w:p>
+      <w:r>
+        <w:t>- Kỳ vọng: Hệ thống báo lỗi khi số lượng xuất &gt; (Tổng tồn - Đã giữ chỗ).</w:t>
+      </w:r>
+    </w:p>
+    <w:p>
+      <w:r>
+        <w:t>Kịch bản 3 (TC_OUT_03): Quy trình lấy hàng của nhân viên</w:t>
+      </w:r>
+    </w:p>
+    <w:p>
+      <w:r>
+        <w:t>- Mục tiêu: Kiểm tra trạng thái đơn hàng khi nhân viên quét barcode lấy hàng thành công.</w:t>
+      </w:r>
+    </w:p>
+    <w:p>
+      <w:r>
+        <w:t>- Kỳ vọng: Trạng thái chuyển sang "Picked", cập nhật số lượng thực tế lấy.</w:t>
+      </w:r>
+    </w:p>
+    <w:p>
       <w:pPr>
         <w:pStyle w:val="Heading2"/>
         <w:spacing w:before="120" w:line="360" w:lineRule="auto"/>
@@ -12034,6 +12234,21 @@
       <w:bookmarkEnd w:id="22"/>
     </w:p>
     <w:p>
+      <w:r>
+        <w:t>- Tất cả các test case quan trọng liên quan đến logic xuất kho và giữ chỗ (Allocation) đều vượt qua 100%.</w:t>
+      </w:r>
+    </w:p>
+    <w:p>
+      <w:r>
+        <w:t>- Hệ thống xử lý chính xác các trường hợp tranh chấp tồn kho khi có nhiều đơn hàng cùng lúc.</w:t>
+      </w:r>
+    </w:p>
+    <w:p>
+      <w:r>
+        <w:t>- Hiệu suất xử lý thuật toán FIFO/FEFO đáp ứng tốt với danh mục hàng hóa lớn.</w:t>
+      </w:r>
+    </w:p>
+    <w:p>
       <w:pPr>
         <w:pStyle w:val="Heading2"/>
         <w:spacing w:before="120" w:line="360" w:lineRule="auto"/>
@@ -12103,6 +12318,16 @@
       <w:bookmarkEnd w:id="23"/>
     </w:p>
     <w:p>
+      <w:r>
+        <w:t>- Ưu điểm: Logic nghiệp vụ chặt chẽ, giao diện thân thiện, dễ sử dụng. Hệ thống xử lý tốt việc quản lý tồn kho theo vị trí chi tiết.</w:t>
+      </w:r>
+    </w:p>
+    <w:p>
+      <w:r>
+        <w:t>- Nhược điểm: Cần bổ sung thêm các báo cáo phân tích sâu về hiệu suất kho và dự báo nhu cầu.</w:t>
+      </w:r>
+    </w:p>
+    <w:p>
       <w:pPr>
         <w:pStyle w:val="Heading1"/>
         <w:rPr>
@@ -12193,6 +12418,21 @@
       <w:bookmarkEnd w:id="25"/>
     </w:p>
     <w:p>
+      <w:r>
+        <w:t>- Đồ án đã hoàn thành mục tiêu xây dựng một hệ thống Quản lý Kho hàng (WMS) cơ bản, hỗ trợ đầy đủ các nghiệp vụ Nhập - Xuất - Tồn.</w:t>
+      </w:r>
+    </w:p>
+    <w:p>
+      <w:r>
+        <w:t>- Áp dụng thành công các công nghệ hiện đại như Spring Boot 3, React và kiến trúc Microservices/Modular Monolith.</w:t>
+      </w:r>
+    </w:p>
+    <w:p>
+      <w:r>
+        <w:t>- Giải quyết được bài toán tối ưu hóa vị trí và quản lý lô hàng theo FIFO/FEFO.</w:t>
+      </w:r>
+    </w:p>
+    <w:p>
       <w:pPr>
         <w:pStyle w:val="Heading2"/>
         <w:spacing w:before="120" w:line="360" w:lineRule="auto"/>
@@ -12262,6 +12502,21 @@
       <w:bookmarkEnd w:id="26"/>
     </w:p>
     <w:p>
+      <w:r>
+        <w:t>- Hiềm rõ quy trình vận hành kho thực tế và cách chuyển đổi chúng thành các module phần mềm.</w:t>
+      </w:r>
+    </w:p>
+    <w:p>
+      <w:r>
+        <w:t>- Kỹ năng xử lý giao dịch (Transaction) và đảm bảo tính nhất quán dữ liệu trong hệ thống lớn.</w:t>
+      </w:r>
+    </w:p>
+    <w:p>
+      <w:r>
+        <w:t>- Tầm quan trọng của việc viết Unit Test cho các logic nghiệp vụ phức tạp.</w:t>
+      </w:r>
+    </w:p>
+    <w:p>
       <w:pPr>
         <w:pStyle w:val="Heading2"/>
         <w:spacing w:before="120" w:line="360" w:lineRule="auto"/>
@@ -12329,6 +12584,21 @@
         <w:t>Hướng phát triển</w:t>
       </w:r>
       <w:bookmarkEnd w:id="27"/>
+    </w:p>
+    <w:p>
+      <w:r>
+        <w:t>- Tích hợp công nghệ RFID/Barcode nâng cao để tự động hóa hoàn toàn quy trình nhận hàng.</w:t>
+      </w:r>
+    </w:p>
+    <w:p>
+      <w:r>
+        <w:t>- Phát triển ứng dụng Mobile Native cho nhân viên kho để tối ưu hóa việc di chuyển và thao tác.</w:t>
+      </w:r>
+    </w:p>
+    <w:p>
+      <w:r>
+        <w:t>- Áp dụng AI/Machine Learning để dự báo xu hướng tồn kho và gợi ý tối ưu hóa không gian lưu trữ.</w:t>
+      </w:r>
     </w:p>
     <w:p>
       <w:pPr>

</xml_diff>